<commit_message>
preliminary species level analisis and results preliminary community level exploration
</commit_message>
<xml_diff>
--- a/doc/Ms_0_methods.docx
+++ b/doc/Ms_0_methods.docx
@@ -4,49 +4,629 @@
   <w:body>
     <w:p>
       <w:pPr>
+        <w:pStyle w:val="Ttulo1"/>
+        <w:rPr>
+          <w:rFonts w:eastAsia="Times New Roman"/>
+          <w:bdr w:val="none" w:sz="0" w:space="0" w:color="auto" w:frame="1"/>
+          <w:lang w:eastAsia="ca-ES"/>
+        </w:rPr>
+      </w:pPr>
+      <w:r>
+        <w:rPr>
+          <w:rFonts w:eastAsia="Times New Roman"/>
+          <w:bdr w:val="none" w:sz="0" w:space="0" w:color="auto" w:frame="1"/>
+          <w:lang w:eastAsia="ca-ES"/>
+        </w:rPr>
+        <w:t xml:space="preserve">Prospective title: Germination drivers of </w:t>
+      </w:r>
+      <w:proofErr w:type="gramStart"/>
+      <w:r>
+        <w:rPr>
+          <w:rFonts w:eastAsia="Times New Roman"/>
+          <w:bdr w:val="none" w:sz="0" w:space="0" w:color="auto" w:frame="1"/>
+          <w:lang w:eastAsia="ca-ES"/>
+        </w:rPr>
+        <w:t>alpine  communities</w:t>
+      </w:r>
+      <w:proofErr w:type="gramEnd"/>
+    </w:p>
+    <w:p>
+      <w:pPr>
+        <w:spacing w:after="0" w:line="360" w:lineRule="auto"/>
+        <w:textAlignment w:val="baseline"/>
+        <w:rPr>
+          <w:bdr w:val="none" w:sz="0" w:space="0" w:color="auto" w:frame="1"/>
+          <w:lang w:val="es-ES" w:eastAsia="ca-ES"/>
+        </w:rPr>
+      </w:pPr>
+    </w:p>
+    <w:p>
+      <w:pPr>
+        <w:spacing w:after="0" w:line="360" w:lineRule="auto"/>
+        <w:textAlignment w:val="baseline"/>
+        <w:rPr>
+          <w:b/>
+          <w:bCs/>
+          <w:bdr w:val="none" w:sz="0" w:space="0" w:color="auto" w:frame="1"/>
+          <w:lang w:val="es-ES" w:eastAsia="ca-ES"/>
+        </w:rPr>
+      </w:pPr>
+      <w:r>
+        <w:rPr>
+          <w:b/>
+          <w:bCs/>
+          <w:bdr w:val="none" w:sz="0" w:space="0" w:color="auto" w:frame="1"/>
+          <w:lang w:val="es-ES" w:eastAsia="ca-ES"/>
+        </w:rPr>
+        <w:t xml:space="preserve">Prospective </w:t>
+      </w:r>
+      <w:proofErr w:type="spellStart"/>
+      <w:r>
+        <w:rPr>
+          <w:b/>
+          <w:bCs/>
+          <w:bdr w:val="none" w:sz="0" w:space="0" w:color="auto" w:frame="1"/>
+          <w:lang w:val="es-ES" w:eastAsia="ca-ES"/>
+        </w:rPr>
+        <w:t>author</w:t>
+      </w:r>
+      <w:proofErr w:type="spellEnd"/>
+      <w:r>
+        <w:rPr>
+          <w:b/>
+          <w:bCs/>
+          <w:bdr w:val="none" w:sz="0" w:space="0" w:color="auto" w:frame="1"/>
+          <w:lang w:val="es-ES" w:eastAsia="ca-ES"/>
+        </w:rPr>
+        <w:t xml:space="preserve"> </w:t>
+      </w:r>
+      <w:proofErr w:type="spellStart"/>
+      <w:r>
+        <w:rPr>
+          <w:b/>
+          <w:bCs/>
+          <w:bdr w:val="none" w:sz="0" w:space="0" w:color="auto" w:frame="1"/>
+          <w:lang w:val="es-ES" w:eastAsia="ca-ES"/>
+        </w:rPr>
+        <w:t>list</w:t>
+      </w:r>
+      <w:proofErr w:type="spellEnd"/>
+      <w:r>
+        <w:rPr>
+          <w:b/>
+          <w:bCs/>
+          <w:bdr w:val="none" w:sz="0" w:space="0" w:color="auto" w:frame="1"/>
+          <w:lang w:val="es-ES" w:eastAsia="ca-ES"/>
+        </w:rPr>
+        <w:t xml:space="preserve">: </w:t>
+      </w:r>
+    </w:p>
+    <w:p>
+      <w:pPr>
+        <w:spacing w:after="0" w:line="360" w:lineRule="auto"/>
+        <w:textAlignment w:val="baseline"/>
+        <w:rPr>
+          <w:rFonts w:eastAsia="Times New Roman" w:cstheme="minorHAnsi"/>
+          <w:bCs/>
+          <w:color w:val="000000"/>
+          <w:bdr w:val="none" w:sz="0" w:space="0" w:color="auto" w:frame="1"/>
+          <w:lang w:val="es-ES" w:eastAsia="ca-ES"/>
+        </w:rPr>
+      </w:pPr>
+      <w:r>
+        <w:rPr>
+          <w:rFonts w:eastAsia="Times New Roman" w:cstheme="minorHAnsi"/>
+          <w:bCs/>
+          <w:color w:val="000000"/>
+          <w:u w:val="single"/>
+          <w:bdr w:val="none" w:sz="0" w:space="0" w:color="auto" w:frame="1"/>
+          <w:lang w:val="es-ES" w:eastAsia="ca-ES"/>
+        </w:rPr>
+        <w:t>Espinosa del Alba, C.,</w:t>
+      </w:r>
+      <w:r>
+        <w:rPr>
+          <w:rFonts w:eastAsia="Times New Roman" w:cstheme="minorHAnsi"/>
+          <w:bCs/>
+          <w:color w:val="000000"/>
+          <w:bdr w:val="none" w:sz="0" w:space="0" w:color="auto" w:frame="1"/>
+          <w:lang w:val="es-ES" w:eastAsia="ca-ES"/>
+        </w:rPr>
+        <w:t xml:space="preserve"> Fernández-Pascual, E.</w:t>
+      </w:r>
+      <w:r>
+        <w:rPr>
+          <w:rFonts w:eastAsia="Times New Roman" w:cstheme="minorHAnsi"/>
+          <w:bCs/>
+          <w:color w:val="000000"/>
+          <w:bdr w:val="none" w:sz="0" w:space="0" w:color="auto" w:frame="1"/>
+          <w:lang w:val="es-ES" w:eastAsia="ca-ES"/>
+        </w:rPr>
+        <w:t>, G</w:t>
+      </w:r>
+      <w:r>
+        <w:rPr>
+          <w:rFonts w:eastAsia="Times New Roman" w:cstheme="minorHAnsi"/>
+          <w:bCs/>
+          <w:color w:val="000000"/>
+          <w:bdr w:val="none" w:sz="0" w:space="0" w:color="auto" w:frame="1"/>
+          <w:lang w:val="es-ES" w:eastAsia="ca-ES"/>
+        </w:rPr>
+        <w:t>ö</w:t>
+      </w:r>
+      <w:r>
+        <w:rPr>
+          <w:rFonts w:eastAsia="Times New Roman" w:cstheme="minorHAnsi"/>
+          <w:bCs/>
+          <w:color w:val="000000"/>
+          <w:bdr w:val="none" w:sz="0" w:space="0" w:color="auto" w:frame="1"/>
+          <w:lang w:val="es-ES" w:eastAsia="ca-ES"/>
+        </w:rPr>
+        <w:t>tzenberger, L.</w:t>
+      </w:r>
+      <w:r>
+        <w:rPr>
+          <w:rFonts w:eastAsia="Times New Roman" w:cstheme="minorHAnsi"/>
+          <w:bCs/>
+          <w:color w:val="000000"/>
+          <w:bdr w:val="none" w:sz="0" w:space="0" w:color="auto" w:frame="1"/>
+          <w:lang w:val="es-ES" w:eastAsia="ca-ES"/>
+        </w:rPr>
+        <w:t xml:space="preserve"> &amp; Jiménez-Alfaro, B.</w:t>
+      </w:r>
+    </w:p>
+    <w:p>
+      <w:pPr>
+        <w:spacing w:after="0" w:line="360" w:lineRule="auto"/>
+        <w:textAlignment w:val="baseline"/>
+        <w:rPr>
+          <w:rFonts w:eastAsia="Times New Roman" w:cstheme="minorHAnsi"/>
+          <w:bCs/>
+          <w:color w:val="000000"/>
+          <w:bdr w:val="none" w:sz="0" w:space="0" w:color="auto" w:frame="1"/>
+          <w:lang w:val="es-ES" w:eastAsia="ca-ES"/>
+        </w:rPr>
+      </w:pPr>
+    </w:p>
+    <w:p>
+      <w:pPr>
+        <w:spacing w:after="0" w:line="360" w:lineRule="auto"/>
+        <w:textAlignment w:val="baseline"/>
+        <w:rPr>
+          <w:rFonts w:eastAsia="Times New Roman" w:cstheme="minorHAnsi"/>
+          <w:b/>
+          <w:color w:val="000000"/>
+          <w:bdr w:val="none" w:sz="0" w:space="0" w:color="auto" w:frame="1"/>
+          <w:lang w:val="es-ES" w:eastAsia="ca-ES"/>
+        </w:rPr>
+      </w:pPr>
+      <w:proofErr w:type="spellStart"/>
+      <w:r>
+        <w:rPr>
+          <w:rFonts w:eastAsia="Times New Roman" w:cstheme="minorHAnsi"/>
+          <w:b/>
+          <w:color w:val="000000"/>
+          <w:bdr w:val="none" w:sz="0" w:space="0" w:color="auto" w:frame="1"/>
+          <w:lang w:val="es-ES" w:eastAsia="ca-ES"/>
+        </w:rPr>
+        <w:t>Affiliations</w:t>
+      </w:r>
+      <w:proofErr w:type="spellEnd"/>
+    </w:p>
+    <w:p>
+      <w:pPr>
+        <w:spacing w:after="0" w:line="360" w:lineRule="auto"/>
+        <w:textAlignment w:val="baseline"/>
+        <w:rPr>
+          <w:rFonts w:eastAsia="Times New Roman" w:cstheme="minorHAnsi"/>
+          <w:color w:val="000000"/>
+          <w:lang w:val="es-ES" w:eastAsia="ca-ES"/>
+        </w:rPr>
+      </w:pPr>
+      <w:r>
+        <w:rPr>
+          <w:rFonts w:eastAsia="Times New Roman" w:cstheme="minorHAnsi"/>
+          <w:color w:val="000000"/>
+          <w:lang w:val="en-US" w:eastAsia="ca-ES"/>
+        </w:rPr>
+        <w:t xml:space="preserve">Biodiversity Research Institute, IMIB (Univ. </w:t>
+      </w:r>
+      <w:r>
+        <w:rPr>
+          <w:rFonts w:eastAsia="Times New Roman" w:cstheme="minorHAnsi"/>
+          <w:color w:val="000000"/>
+          <w:lang w:val="es-ES" w:eastAsia="ca-ES"/>
+        </w:rPr>
+        <w:t>Oviedo-CSIC-</w:t>
+      </w:r>
+      <w:proofErr w:type="spellStart"/>
+      <w:r>
+        <w:rPr>
+          <w:rFonts w:eastAsia="Times New Roman" w:cstheme="minorHAnsi"/>
+          <w:color w:val="000000"/>
+          <w:lang w:val="es-ES" w:eastAsia="ca-ES"/>
+        </w:rPr>
+        <w:t>Princ</w:t>
+      </w:r>
+      <w:proofErr w:type="spellEnd"/>
+      <w:r>
+        <w:rPr>
+          <w:rFonts w:eastAsia="Times New Roman" w:cstheme="minorHAnsi"/>
+          <w:color w:val="000000"/>
+          <w:lang w:val="es-ES" w:eastAsia="ca-ES"/>
+        </w:rPr>
+        <w:t xml:space="preserve">. Asturias), 33600 Mieres, </w:t>
+      </w:r>
+      <w:proofErr w:type="spellStart"/>
+      <w:r>
+        <w:rPr>
+          <w:rFonts w:eastAsia="Times New Roman" w:cstheme="minorHAnsi"/>
+          <w:color w:val="000000"/>
+          <w:lang w:val="es-ES" w:eastAsia="ca-ES"/>
+        </w:rPr>
+        <w:t>Spain</w:t>
+      </w:r>
+      <w:proofErr w:type="spellEnd"/>
+      <w:r>
+        <w:rPr>
+          <w:rFonts w:eastAsia="Times New Roman" w:cstheme="minorHAnsi"/>
+          <w:color w:val="000000"/>
+          <w:lang w:val="es-ES" w:eastAsia="ca-ES"/>
+        </w:rPr>
+        <w:t xml:space="preserve">. </w:t>
+      </w:r>
+    </w:p>
+    <w:p>
+      <w:pPr>
+        <w:spacing w:after="0" w:line="360" w:lineRule="auto"/>
+        <w:textAlignment w:val="baseline"/>
+        <w:rPr>
+          <w:rFonts w:eastAsia="Times New Roman" w:cstheme="minorHAnsi"/>
+          <w:color w:val="000000"/>
+          <w:lang w:val="en-US" w:eastAsia="ca-ES"/>
+        </w:rPr>
+      </w:pPr>
+      <w:r>
+        <w:rPr>
+          <w:rFonts w:eastAsia="Times New Roman" w:cstheme="minorHAnsi"/>
+          <w:color w:val="000000"/>
+          <w:lang w:val="en-US" w:eastAsia="ca-ES"/>
+        </w:rPr>
+        <w:t xml:space="preserve">Czech Academy of Sciences, </w:t>
+      </w:r>
+      <w:r>
+        <w:rPr>
+          <w:rFonts w:eastAsia="Times New Roman" w:cstheme="minorHAnsi"/>
+          <w:color w:val="000000"/>
+          <w:lang w:val="en-US" w:eastAsia="ca-ES"/>
+        </w:rPr>
+        <w:t xml:space="preserve">Institute of Botany, </w:t>
+      </w:r>
+      <w:r>
+        <w:rPr>
+          <w:rFonts w:eastAsia="Times New Roman" w:cstheme="minorHAnsi"/>
+          <w:color w:val="000000"/>
+          <w:lang w:val="en-US" w:eastAsia="ca-ES"/>
+        </w:rPr>
+        <w:t>C</w:t>
+      </w:r>
+      <w:r>
+        <w:rPr>
+          <w:rFonts w:eastAsia="Times New Roman" w:cstheme="minorHAnsi"/>
+          <w:color w:val="000000"/>
+          <w:lang w:val="en-US" w:eastAsia="ca-ES"/>
+        </w:rPr>
+        <w:t>zech Republic</w:t>
+      </w:r>
+    </w:p>
+    <w:p>
+      <w:pPr>
+        <w:pStyle w:val="Textoindependiente"/>
+        <w:rPr>
+          <w:lang w:val="en-US" w:eastAsia="ca-ES"/>
+        </w:rPr>
+      </w:pPr>
+      <w:r>
+        <w:rPr>
+          <w:b/>
+          <w:bCs/>
+          <w:lang w:val="en-US" w:eastAsia="ca-ES"/>
+        </w:rPr>
+        <w:t>Correspondence author</w:t>
+      </w:r>
+      <w:r>
+        <w:rPr>
+          <w:lang w:val="en-US" w:eastAsia="ca-ES"/>
+        </w:rPr>
+        <w:t xml:space="preserve">: </w:t>
+      </w:r>
+    </w:p>
+    <w:p>
+      <w:pPr>
+        <w:pStyle w:val="Textoindependiente"/>
+        <w:rPr>
+          <w:color w:val="0563C1" w:themeColor="hyperlink"/>
+          <w:u w:val="single"/>
+          <w:lang w:val="es-ES"/>
+        </w:rPr>
+      </w:pPr>
+      <w:r>
+        <w:rPr>
+          <w:lang w:val="es-ES"/>
+        </w:rPr>
+        <w:t>Clara Espinosa Del Alba</w:t>
+      </w:r>
+      <w:r>
+        <w:rPr>
+          <w:rFonts w:eastAsia="Times New Roman" w:cstheme="minorHAnsi"/>
+          <w:color w:val="000000"/>
+          <w:lang w:val="es-ES" w:eastAsia="ca-ES"/>
+        </w:rPr>
+        <w:t xml:space="preserve">. </w:t>
+      </w:r>
+      <w:r>
+        <w:rPr>
+          <w:lang w:val="es-ES"/>
+        </w:rPr>
+        <w:t xml:space="preserve"> Email: </w:t>
+      </w:r>
+      <w:hyperlink r:id="rId7" w:history="1">
+        <w:r>
+          <w:rPr>
+            <w:rStyle w:val="Hipervnculo"/>
+            <w:lang w:val="es-ES"/>
+          </w:rPr>
+          <w:t>espinosaclara@uniovi.es</w:t>
+        </w:r>
+      </w:hyperlink>
+    </w:p>
+    <w:p>
+      <w:pPr>
+        <w:spacing w:after="0" w:line="360" w:lineRule="auto"/>
+        <w:textAlignment w:val="baseline"/>
+        <w:rPr>
+          <w:rFonts w:eastAsia="Times New Roman" w:cstheme="minorHAnsi"/>
+          <w:b/>
+          <w:bCs/>
+          <w:color w:val="000000"/>
+          <w:bdr w:val="none" w:sz="0" w:space="0" w:color="auto" w:frame="1"/>
+          <w:lang w:val="es-ES" w:eastAsia="ca-ES"/>
+        </w:rPr>
+      </w:pPr>
+      <w:proofErr w:type="spellStart"/>
+      <w:r>
+        <w:rPr>
+          <w:rFonts w:eastAsia="Times New Roman" w:cstheme="minorHAnsi"/>
+          <w:b/>
+          <w:bCs/>
+          <w:color w:val="000000"/>
+          <w:bdr w:val="none" w:sz="0" w:space="0" w:color="auto" w:frame="1"/>
+          <w:lang w:val="es-ES" w:eastAsia="ca-ES"/>
+        </w:rPr>
+        <w:t>ORCID</w:t>
+      </w:r>
+      <w:r>
+        <w:rPr>
+          <w:rFonts w:eastAsia="Times New Roman" w:cstheme="minorHAnsi"/>
+          <w:b/>
+          <w:bCs/>
+          <w:color w:val="000000"/>
+          <w:bdr w:val="none" w:sz="0" w:space="0" w:color="auto" w:frame="1"/>
+          <w:lang w:val="es-ES" w:eastAsia="ca-ES"/>
+        </w:rPr>
+        <w:t>s</w:t>
+      </w:r>
+      <w:proofErr w:type="spellEnd"/>
+    </w:p>
+    <w:p>
+      <w:pPr>
+        <w:spacing w:after="0" w:line="360" w:lineRule="auto"/>
+        <w:textAlignment w:val="baseline"/>
+        <w:rPr>
+          <w:u w:val="single"/>
+          <w:lang w:val="es-ES"/>
+        </w:rPr>
+      </w:pPr>
+      <w:r>
+        <w:rPr>
+          <w:lang w:val="es-ES"/>
+        </w:rPr>
+        <w:t>Clara Espinosa Del Alba</w:t>
+      </w:r>
+      <w:r>
+        <w:rPr>
+          <w:u w:val="single"/>
+          <w:lang w:val="es-ES"/>
+        </w:rPr>
+        <w:t xml:space="preserve">. </w:t>
+      </w:r>
+      <w:r>
+        <w:rPr>
+          <w:rStyle w:val="Hipervnculo"/>
+          <w:lang w:val="es-ES"/>
+        </w:rPr>
+        <w:t xml:space="preserve"> https://orcid.org/0000-0001-8634-5808</w:t>
+      </w:r>
+    </w:p>
+    <w:p>
+      <w:pPr>
+        <w:spacing w:after="0" w:line="360" w:lineRule="auto"/>
+        <w:textAlignment w:val="baseline"/>
+        <w:rPr>
+          <w:rStyle w:val="Hipervnculo"/>
+          <w:rFonts w:cstheme="minorHAnsi"/>
+          <w:lang w:val="es-ES"/>
+        </w:rPr>
+      </w:pPr>
+      <w:r>
+        <w:rPr>
+          <w:rFonts w:cstheme="minorHAnsi"/>
+          <w:lang w:val="es-ES"/>
+        </w:rPr>
+        <w:t>Eduardo Fernández-Pascual</w:t>
+      </w:r>
+      <w:r>
+        <w:rPr>
+          <w:rFonts w:cstheme="minorHAnsi"/>
+          <w:lang w:val="es-ES"/>
+        </w:rPr>
+        <w:t>.</w:t>
+      </w:r>
+      <w:r>
+        <w:rPr>
+          <w:rFonts w:cstheme="minorHAnsi"/>
+          <w:lang w:val="es-ES"/>
+        </w:rPr>
+        <w:t xml:space="preserve"> </w:t>
+      </w:r>
+      <w:hyperlink r:id="rId8" w:history="1">
+        <w:r>
+          <w:rPr>
+            <w:rStyle w:val="Hipervnculo"/>
+            <w:rFonts w:cstheme="minorHAnsi"/>
+            <w:lang w:val="es-ES"/>
+          </w:rPr>
+          <w:t>https://orcid.org/0000-0002-4743-9577</w:t>
+        </w:r>
+      </w:hyperlink>
+    </w:p>
+    <w:p>
+      <w:pPr>
+        <w:spacing w:after="0" w:line="360" w:lineRule="auto"/>
+        <w:textAlignment w:val="baseline"/>
+        <w:rPr>
+          <w:lang w:val="es-ES"/>
+        </w:rPr>
+      </w:pPr>
+      <w:r>
+        <w:rPr>
+          <w:lang w:val="es-ES"/>
+        </w:rPr>
+        <w:t xml:space="preserve">Lars </w:t>
+      </w:r>
+      <w:proofErr w:type="spellStart"/>
+      <w:r>
+        <w:rPr>
+          <w:lang w:val="es-ES"/>
+        </w:rPr>
+        <w:t>Götzenberber</w:t>
+      </w:r>
+      <w:proofErr w:type="spellEnd"/>
+      <w:r>
+        <w:rPr>
+          <w:lang w:val="es-ES"/>
+        </w:rPr>
+        <w:t xml:space="preserve">. </w:t>
+      </w:r>
+      <w:r>
+        <w:rPr>
+          <w:lang w:val="es-ES"/>
+        </w:rPr>
+        <w:t xml:space="preserve"> </w:t>
+      </w:r>
+      <w:hyperlink r:id="rId9" w:history="1">
+        <w:r>
+          <w:rPr>
+            <w:rStyle w:val="Hipervnculo"/>
+            <w:lang w:val="es-ES"/>
+          </w:rPr>
+          <w:t>https://orcid.org/0000-0003-3040-2900</w:t>
+        </w:r>
+      </w:hyperlink>
+    </w:p>
+    <w:p>
+      <w:pPr>
+        <w:spacing w:after="0" w:line="360" w:lineRule="auto"/>
+        <w:textAlignment w:val="baseline"/>
+        <w:rPr>
+          <w:lang w:val="es-ES"/>
+        </w:rPr>
+      </w:pPr>
+      <w:r>
+        <w:rPr>
+          <w:rFonts w:cstheme="minorHAnsi"/>
+          <w:lang w:val="es-ES"/>
+        </w:rPr>
+        <w:t>Borja Jiménez-Alfaro.</w:t>
+      </w:r>
+      <w:r>
+        <w:rPr>
+          <w:rStyle w:val="Hipervnculo"/>
+          <w:lang w:val="es-ES"/>
+        </w:rPr>
+        <w:t xml:space="preserve"> </w:t>
+      </w:r>
+      <w:hyperlink r:id="rId10" w:history="1">
+        <w:r>
+          <w:rPr>
+            <w:rStyle w:val="Hipervnculo"/>
+            <w:rFonts w:cstheme="minorHAnsi"/>
+            <w:lang w:val="es-ES"/>
+          </w:rPr>
+          <w:t>https://orcid.org/0000-0001-6601-9597</w:t>
+        </w:r>
+      </w:hyperlink>
+    </w:p>
+    <w:p>
+      <w:pPr>
+        <w:rPr>
+          <w:lang w:val="es-ES" w:eastAsia="ca-ES"/>
+        </w:rPr>
+      </w:pPr>
+    </w:p>
+    <w:p>
+      <w:pPr>
         <w:pStyle w:val="Ttulo2"/>
         <w:spacing w:after="160" w:line="360" w:lineRule="auto"/>
         <w:rPr>
           <w:rFonts w:eastAsia="Times New Roman"/>
           <w:bdr w:val="none" w:sz="0" w:space="0" w:color="auto" w:frame="1"/>
-          <w:lang w:eastAsia="ca-ES"/>
-        </w:rPr>
-      </w:pPr>
+          <w:lang w:val="es-ES" w:eastAsia="ca-ES"/>
+        </w:rPr>
+      </w:pPr>
+      <w:proofErr w:type="spellStart"/>
       <w:r>
         <w:rPr>
           <w:rFonts w:eastAsia="Times New Roman"/>
           <w:bdr w:val="none" w:sz="0" w:space="0" w:color="auto" w:frame="1"/>
-          <w:lang w:eastAsia="ca-ES"/>
-        </w:rPr>
-        <w:t>2. Material and Methods</w:t>
-      </w:r>
+          <w:lang w:val="es-ES" w:eastAsia="ca-ES"/>
+        </w:rPr>
+        <w:t>Abstract</w:t>
+      </w:r>
+      <w:proofErr w:type="spellEnd"/>
     </w:p>
     <w:p>
       <w:pPr>
+        <w:rPr>
+          <w:lang w:val="es-ES" w:eastAsia="ca-ES"/>
+        </w:rPr>
+      </w:pPr>
+    </w:p>
+    <w:p>
+      <w:pPr>
         <w:pStyle w:val="Ttulo2"/>
-        <w:spacing w:after="160" w:line="360" w:lineRule="auto"/>
-        <w:rPr>
-          <w:rFonts w:eastAsia="Times New Roman"/>
-          <w:bdr w:val="none" w:sz="0" w:space="0" w:color="auto" w:frame="1"/>
-          <w:lang w:eastAsia="ca-ES"/>
-        </w:rPr>
-      </w:pPr>
-      <w:r>
-        <w:rPr>
-          <w:rFonts w:eastAsia="Times New Roman"/>
-          <w:bdr w:val="none" w:sz="0" w:space="0" w:color="auto" w:frame="1"/>
-          <w:lang w:eastAsia="ca-ES"/>
-        </w:rPr>
-        <w:t xml:space="preserve">2.1 </w:t>
-      </w:r>
+        <w:numPr>
+          <w:ilvl w:val="0"/>
+          <w:numId w:val="28"/>
+        </w:numPr>
+        <w:rPr>
+          <w:lang w:val="es-ES" w:eastAsia="ca-ES"/>
+        </w:rPr>
+      </w:pPr>
       <w:commentRangeStart w:id="0"/>
-      <w:r>
-        <w:rPr>
-          <w:rFonts w:eastAsia="Times New Roman"/>
-          <w:bdr w:val="none" w:sz="0" w:space="0" w:color="auto" w:frame="1"/>
-          <w:lang w:eastAsia="ca-ES"/>
-        </w:rPr>
-        <w:t>Study system</w:t>
+      <w:proofErr w:type="spellStart"/>
+      <w:r>
+        <w:rPr>
+          <w:lang w:val="es-ES" w:eastAsia="ca-ES"/>
+        </w:rPr>
+        <w:t>Introduction</w:t>
+      </w:r>
+      <w:proofErr w:type="spellEnd"/>
+      <w:r>
+        <w:rPr>
+          <w:lang w:val="es-ES" w:eastAsia="ca-ES"/>
+        </w:rPr>
+        <w:t xml:space="preserve"> </w:t>
       </w:r>
       <w:commentRangeEnd w:id="0"/>
       <w:r>
@@ -61,9 +641,557 @@
     <w:p>
       <w:pPr>
         <w:spacing w:line="360" w:lineRule="auto"/>
-        <w:ind w:firstLine="709"/>
         <w:jc w:val="both"/>
         <w:rPr>
+          <w:rFonts w:eastAsia="Arial" w:cstheme="minorHAnsi"/>
+        </w:rPr>
+      </w:pPr>
+      <w:r>
+        <w:rPr>
+          <w:rFonts w:eastAsia="Arial" w:cstheme="minorHAnsi"/>
+        </w:rPr>
+        <w:t xml:space="preserve">Worldwide, alpine plants occur above the climatic </w:t>
+      </w:r>
+      <w:proofErr w:type="gramStart"/>
+      <w:r>
+        <w:rPr>
+          <w:rFonts w:eastAsia="Arial" w:cstheme="minorHAnsi"/>
+        </w:rPr>
+        <w:t>treeline</w:t>
+      </w:r>
+      <w:proofErr w:type="gramEnd"/>
+      <w:r>
+        <w:rPr>
+          <w:rFonts w:eastAsia="Arial" w:cstheme="minorHAnsi"/>
+        </w:rPr>
+        <w:t xml:space="preserve"> and they are generally subjected to harsh conditions such as freezing temperatures, snow cover and strong winds, despite regional and latitudinal variation (Körner et al. 2017). Recently, it has been noted that the abundance and distribution of alpine plants strongly depends on micro-topographic variation, which accounts for drastic changes in temperature and related factors (Scherrer &amp; Körner 2010; </w:t>
+      </w:r>
+      <w:proofErr w:type="spellStart"/>
+      <w:r>
+        <w:rPr>
+          <w:rFonts w:eastAsia="Arial" w:cstheme="minorHAnsi"/>
+        </w:rPr>
+        <w:t>Kulonen</w:t>
+      </w:r>
+      <w:proofErr w:type="spellEnd"/>
+      <w:r>
+        <w:rPr>
+          <w:rFonts w:eastAsia="Arial" w:cstheme="minorHAnsi"/>
+        </w:rPr>
+        <w:t xml:space="preserve"> et al. 2018). An increasing number of studies have reported relationships between micro-habitat variation and the compositional and functional diversity of alpine plant communities (e.g. Choler 2005; Opedal et al. 2014; Stark et al. 2017; Blonder et al. 2018) but functional approaches have mostly focused on adult-plant traits. At the regeneration stage, studies suggested that the seed germination niche is influenced by micro-site temperature and snow cover (Fernández-Pascual et al. 2016) and soil bedrock (Tudela-</w:t>
+      </w:r>
+      <w:proofErr w:type="spellStart"/>
+      <w:r>
+        <w:rPr>
+          <w:rFonts w:eastAsia="Arial" w:cstheme="minorHAnsi"/>
+        </w:rPr>
+        <w:t>Isanta</w:t>
+      </w:r>
+      <w:proofErr w:type="spellEnd"/>
+      <w:r>
+        <w:rPr>
+          <w:rFonts w:eastAsia="Arial" w:cstheme="minorHAnsi"/>
+        </w:rPr>
+        <w:t xml:space="preserve"> et al. 2018). Relatively higher temperatures at the microsite also may determine </w:t>
+      </w:r>
+      <w:sdt>
+        <w:sdtPr>
+          <w:rPr>
+            <w:rFonts w:cstheme="minorHAnsi"/>
+          </w:rPr>
+          <w:tag w:val="goog_rdk_8"/>
+          <w:id w:val="30777417"/>
+        </w:sdtPr>
+        <w:sdtContent/>
+      </w:sdt>
+      <w:r>
+        <w:rPr>
+          <w:rFonts w:eastAsia="Arial" w:cstheme="minorHAnsi"/>
+        </w:rPr>
+        <w:t>shifts in germination timing and increasing recruitment of alpine populations in both temperate (Mondoni et al. 2015) and Mediterranean (Giménez-Benavides et al. 2018) systems.</w:t>
+      </w:r>
+    </w:p>
+    <w:p>
+      <w:pPr>
+        <w:spacing w:line="360" w:lineRule="auto"/>
+        <w:jc w:val="both"/>
+        <w:rPr>
+          <w:rFonts w:eastAsia="Arial" w:cstheme="minorHAnsi"/>
+        </w:rPr>
+      </w:pPr>
+      <w:r>
+        <w:rPr>
+          <w:rFonts w:eastAsia="Arial" w:cstheme="minorHAnsi"/>
+        </w:rPr>
+        <w:lastRenderedPageBreak/>
+        <w:t xml:space="preserve">Understanding the role of seed-trait variation in alpine plant diversity will benefit </w:t>
+      </w:r>
+      <w:sdt>
+        <w:sdtPr>
+          <w:rPr>
+            <w:rFonts w:cstheme="minorHAnsi"/>
+          </w:rPr>
+          <w:tag w:val="goog_rdk_10"/>
+          <w:id w:val="-750579298"/>
+        </w:sdtPr>
+        <w:sdtContent>
+          <w:r>
+            <w:rPr>
+              <w:rFonts w:eastAsia="Arial" w:cstheme="minorHAnsi"/>
+            </w:rPr>
+            <w:t>from</w:t>
+          </w:r>
+        </w:sdtContent>
+      </w:sdt>
+      <w:sdt>
+        <w:sdtPr>
+          <w:rPr>
+            <w:rFonts w:cstheme="minorHAnsi"/>
+          </w:rPr>
+          <w:tag w:val="goog_rdk_11"/>
+          <w:id w:val="909274479"/>
+          <w:showingPlcHdr/>
+        </w:sdtPr>
+        <w:sdtContent>
+          <w:r>
+            <w:rPr>
+              <w:rFonts w:cstheme="minorHAnsi"/>
+            </w:rPr>
+            <w:t xml:space="preserve">     </w:t>
+          </w:r>
+        </w:sdtContent>
+      </w:sdt>
+      <w:r>
+        <w:rPr>
+          <w:rFonts w:eastAsia="Arial" w:cstheme="minorHAnsi"/>
+        </w:rPr>
+        <w:t xml:space="preserve"> incorporating multi-species approaches at the community level (Jiménez-Alfaro et al. 2016; Saatkamp et al. 2019). Despite multiple theories and modelling approaches in community ecology, empirical research based on observational or experimental data </w:t>
+      </w:r>
+      <w:sdt>
+        <w:sdtPr>
+          <w:rPr>
+            <w:rFonts w:cstheme="minorHAnsi"/>
+          </w:rPr>
+          <w:tag w:val="goog_rdk_12"/>
+          <w:id w:val="-1652827221"/>
+        </w:sdtPr>
+        <w:sdtContent>
+          <w:r>
+            <w:rPr>
+              <w:rFonts w:eastAsia="Arial" w:cstheme="minorHAnsi"/>
+            </w:rPr>
+            <w:t>of</w:t>
+          </w:r>
+        </w:sdtContent>
+      </w:sdt>
+      <w:r>
+        <w:rPr>
+          <w:rFonts w:eastAsia="Arial" w:cstheme="minorHAnsi"/>
+        </w:rPr>
+        <w:t xml:space="preserve"> co-occurring species may be useful to infer high-level processes such as species dispersal and (niche) selection (</w:t>
+      </w:r>
+      <w:proofErr w:type="spellStart"/>
+      <w:r>
+        <w:rPr>
+          <w:rFonts w:eastAsia="Arial" w:cstheme="minorHAnsi"/>
+        </w:rPr>
+        <w:t>Vellend</w:t>
+      </w:r>
+      <w:proofErr w:type="spellEnd"/>
+      <w:r>
+        <w:rPr>
+          <w:rFonts w:eastAsia="Arial" w:cstheme="minorHAnsi"/>
+        </w:rPr>
+        <w:t xml:space="preserve"> 2016). However, the conceptual framework of community assembly may be limited by the lack of seed-trait studies addressing the co-occurrence of plants as the result of regional and local processes such as dispersal, environmental </w:t>
+      </w:r>
+      <w:proofErr w:type="gramStart"/>
+      <w:r>
+        <w:rPr>
+          <w:rFonts w:eastAsia="Arial" w:cstheme="minorHAnsi"/>
+        </w:rPr>
+        <w:t>filtering</w:t>
+      </w:r>
+      <w:proofErr w:type="gramEnd"/>
+      <w:r>
+        <w:rPr>
+          <w:rFonts w:eastAsia="Arial" w:cstheme="minorHAnsi"/>
+        </w:rPr>
+        <w:t xml:space="preserve"> and species interactions (Götzenberger et al. 201</w:t>
+      </w:r>
+      <w:sdt>
+        <w:sdtPr>
+          <w:rPr>
+            <w:rFonts w:cstheme="minorHAnsi"/>
+          </w:rPr>
+          <w:tag w:val="goog_rdk_16"/>
+          <w:id w:val="-403298020"/>
+        </w:sdtPr>
+        <w:sdtContent>
+          <w:r>
+            <w:rPr>
+              <w:rFonts w:eastAsia="Arial" w:cstheme="minorHAnsi"/>
+            </w:rPr>
+            <w:t>2</w:t>
+          </w:r>
+        </w:sdtContent>
+      </w:sdt>
+      <w:r>
+        <w:rPr>
+          <w:rFonts w:eastAsia="Arial" w:cstheme="minorHAnsi"/>
+        </w:rPr>
+        <w:t>).</w:t>
+      </w:r>
+      <w:r>
+        <w:rPr>
+          <w:rFonts w:eastAsia="Arial" w:cstheme="minorHAnsi"/>
+        </w:rPr>
+        <w:t xml:space="preserve"> G</w:t>
+      </w:r>
+      <w:r>
+        <w:rPr>
+          <w:rFonts w:eastAsia="Arial" w:cstheme="minorHAnsi"/>
+        </w:rPr>
+        <w:t xml:space="preserve">ermination of alpine species is regulated by seasonal cycles in temperature and moisture conditions (Baskin &amp; Baskin 2014), but these responses may not be the same for all species living in the same habitat, determining spatial and temporal heterogeneity in this key selective </w:t>
+      </w:r>
+      <w:proofErr w:type="gramStart"/>
+      <w:r>
+        <w:rPr>
+          <w:rFonts w:eastAsia="Arial" w:cstheme="minorHAnsi"/>
+        </w:rPr>
+        <w:t>process</w:t>
+      </w:r>
+      <w:proofErr w:type="gramEnd"/>
+    </w:p>
+    <w:p>
+      <w:pPr>
+        <w:spacing w:line="360" w:lineRule="auto"/>
+        <w:jc w:val="both"/>
+        <w:rPr>
+          <w:rFonts w:eastAsia="Arial" w:cstheme="minorHAnsi"/>
+        </w:rPr>
+      </w:pPr>
+      <w:r>
+        <w:rPr>
+          <w:rFonts w:eastAsia="Arial" w:cstheme="minorHAnsi"/>
+        </w:rPr>
+        <w:t>The question of functional filtering in seeds can be addressed by exploring niche differentiation, a process by which co-occurring species may use the environment differently to avoid competition. Alpine communities are subjected to harsh environmental conditions; therefore, plant competition is expected to be relaxed, and niche-based processes rely on abiotic filters or facilitation (Callaway et al. 2002). Since alpine habitats generally have low water and nutrient resources, niche differentiation may also be the result of multiple, independent species adaptation to harsh conditions during postglacial dispersal, ultimately explaining the relative high diversity of plants in these ecosystems. Several studies have investigated the role of niche-based processes in alpine communities using traits (</w:t>
+      </w:r>
+      <w:proofErr w:type="spellStart"/>
+      <w:r>
+        <w:rPr>
+          <w:rFonts w:eastAsia="Arial" w:cstheme="minorHAnsi"/>
+        </w:rPr>
+        <w:t>Chalmandrier</w:t>
+      </w:r>
+      <w:proofErr w:type="spellEnd"/>
+      <w:r>
+        <w:rPr>
+          <w:rFonts w:eastAsia="Arial" w:cstheme="minorHAnsi"/>
+        </w:rPr>
+        <w:t xml:space="preserve"> et al. 2017, Scherrer et al. 2019) or phylogenetic approaches (Butterfield et al. 2013) to estimate the ecological similarity of co-existing species. However, apart from seed mass, regeneration traits are hardly ever considered, despite existing evidence that life-history stages determine different plant responses across micro-habitats (</w:t>
+      </w:r>
+      <w:proofErr w:type="spellStart"/>
+      <w:r>
+        <w:rPr>
+          <w:rFonts w:eastAsia="Arial" w:cstheme="minorHAnsi"/>
+        </w:rPr>
+        <w:t>Hülber</w:t>
+      </w:r>
+      <w:proofErr w:type="spellEnd"/>
+      <w:r>
+        <w:rPr>
+          <w:rFonts w:eastAsia="Arial" w:cstheme="minorHAnsi"/>
+        </w:rPr>
+        <w:t xml:space="preserve"> et al. 2018). So far, we do not know whether regeneration stages may follow similar or different strategies in alpine plants, and if regeneration traits can provide additional insights into assembly processes, in particular at the level of microsite </w:t>
+      </w:r>
+      <w:proofErr w:type="gramStart"/>
+      <w:r>
+        <w:rPr>
+          <w:rFonts w:eastAsia="Arial" w:cstheme="minorHAnsi"/>
+        </w:rPr>
+        <w:t>variation</w:t>
+      </w:r>
+      <w:proofErr w:type="gramEnd"/>
+    </w:p>
+    <w:p>
+      <w:pPr>
+        <w:spacing w:line="360" w:lineRule="auto"/>
+        <w:jc w:val="both"/>
+        <w:rPr>
+          <w:lang w:val="en-US" w:eastAsia="ca-ES"/>
+        </w:rPr>
+      </w:pPr>
+      <w:r>
+        <w:rPr>
+          <w:lang w:val="en-US" w:eastAsia="ca-ES"/>
+        </w:rPr>
+        <w:t xml:space="preserve">The seed germination niche is the range of environmental conditions which elicit a successful transition from seed to seedling (Grubb 1977). The timing of germination depends on the shape of the germination niche, i.e. the responsiveness to a specific set of environmental germination cues that include temperature, moisture, </w:t>
+      </w:r>
+      <w:proofErr w:type="gramStart"/>
+      <w:r>
+        <w:rPr>
+          <w:lang w:val="en-US" w:eastAsia="ca-ES"/>
+        </w:rPr>
+        <w:t>light</w:t>
+      </w:r>
+      <w:proofErr w:type="gramEnd"/>
+      <w:r>
+        <w:rPr>
+          <w:lang w:val="en-US" w:eastAsia="ca-ES"/>
+        </w:rPr>
+        <w:t xml:space="preserve"> and chemical signals. This shape is generally determined by environmental filters to establishment and tends to match germination with the most </w:t>
+      </w:r>
+      <w:proofErr w:type="spellStart"/>
+      <w:r>
+        <w:rPr>
+          <w:lang w:val="en-US" w:eastAsia="ca-ES"/>
+        </w:rPr>
+        <w:t>favourable</w:t>
+      </w:r>
+      <w:proofErr w:type="spellEnd"/>
+      <w:r>
+        <w:rPr>
+          <w:lang w:val="en-US" w:eastAsia="ca-ES"/>
+        </w:rPr>
+        <w:t xml:space="preserve"> season for seedling survival (Donohue 2014; Fernández-Pascual et al. 2017b). </w:t>
+      </w:r>
+      <w:r>
+        <w:rPr>
+          <w:lang w:val="en-US" w:eastAsia="ca-ES"/>
+        </w:rPr>
+        <w:lastRenderedPageBreak/>
+        <w:t>It follows that communities that differ in their environmental filters for seedling establishment should also differ in the shape of their germination niches (Jurado &amp; Flores 2005). The stronger the environmental filters are, the more homogeneous should be the germination niches of a community, reflecting shared strategies of stress tolerance. In alpine habitats, the environment imposes harsh filters such as short growing seasons, freeze-thaw cycles and drought induced by skeletal soils and frozen groundwater. Nonetheless, it has been difficult to define a single alpine germination niche (</w:t>
+      </w:r>
+      <w:proofErr w:type="spellStart"/>
+      <w:r>
+        <w:rPr>
+          <w:lang w:val="en-US" w:eastAsia="ca-ES"/>
+        </w:rPr>
+        <w:t>Schwienbacher</w:t>
+      </w:r>
+      <w:proofErr w:type="spellEnd"/>
+      <w:r>
+        <w:rPr>
+          <w:lang w:val="en-US" w:eastAsia="ca-ES"/>
+        </w:rPr>
+        <w:t xml:space="preserve"> et al. 2011). As the alpine environment is a mosaic of microhabitats, it seems natural that germination strategies need to be assessed at the microsite level. For example, many alpine species have been found able to germinate in conditions indicative of snow cover, such as 0 ºC and darkness (Giménez-Benavides et al. 2005; Shimono &amp; Kudo 2005). This has been portrayed as a strategy of snow field species, while exposed species of the same community would germinate at higher temperatures and after a dormancy-breaking season (Fernández-Pascual et al. 2017a).</w:t>
+      </w:r>
+    </w:p>
+    <w:p>
+      <w:pPr>
+        <w:pStyle w:val="Ttulo2"/>
+        <w:spacing w:after="160" w:line="360" w:lineRule="auto"/>
+        <w:jc w:val="both"/>
+        <w:rPr>
+          <w:rFonts w:asciiTheme="minorHAnsi" w:eastAsiaTheme="minorHAnsi" w:hAnsiTheme="minorHAnsi" w:cstheme="minorBidi"/>
+          <w:color w:val="auto"/>
+          <w:sz w:val="22"/>
+          <w:szCs w:val="22"/>
+          <w:lang w:val="en-US" w:eastAsia="ca-ES"/>
+        </w:rPr>
+      </w:pPr>
+      <w:commentRangeStart w:id="1"/>
+      <w:r>
+        <w:rPr>
+          <w:rFonts w:asciiTheme="minorHAnsi" w:eastAsiaTheme="minorHAnsi" w:hAnsiTheme="minorHAnsi" w:cstheme="minorBidi"/>
+          <w:color w:val="auto"/>
+          <w:sz w:val="22"/>
+          <w:szCs w:val="22"/>
+          <w:lang w:val="en-US" w:eastAsia="ca-ES"/>
+        </w:rPr>
+        <w:t xml:space="preserve">Hypotheses. </w:t>
+      </w:r>
+      <w:commentRangeEnd w:id="1"/>
+      <w:r>
+        <w:rPr>
+          <w:rStyle w:val="Refdecomentario"/>
+          <w:rFonts w:ascii="Calibri" w:eastAsia="Calibri" w:hAnsi="Calibri" w:cs="Calibri"/>
+          <w:color w:val="auto"/>
+        </w:rPr>
+        <w:commentReference w:id="1"/>
+      </w:r>
+      <w:r>
+        <w:rPr>
+          <w:rFonts w:asciiTheme="minorHAnsi" w:eastAsiaTheme="minorHAnsi" w:hAnsiTheme="minorHAnsi" w:cstheme="minorBidi"/>
+          <w:color w:val="auto"/>
+          <w:sz w:val="22"/>
+          <w:szCs w:val="22"/>
+          <w:lang w:val="en-US" w:eastAsia="ca-ES"/>
+        </w:rPr>
+        <w:t xml:space="preserve">We </w:t>
+      </w:r>
+      <w:proofErr w:type="spellStart"/>
+      <w:r>
+        <w:rPr>
+          <w:rFonts w:asciiTheme="minorHAnsi" w:eastAsiaTheme="minorHAnsi" w:hAnsiTheme="minorHAnsi" w:cstheme="minorBidi"/>
+          <w:color w:val="auto"/>
+          <w:sz w:val="22"/>
+          <w:szCs w:val="22"/>
+          <w:lang w:val="en-US" w:eastAsia="ca-ES"/>
+        </w:rPr>
+        <w:t>hypothesise</w:t>
+      </w:r>
+      <w:proofErr w:type="spellEnd"/>
+      <w:r>
+        <w:rPr>
+          <w:rFonts w:asciiTheme="minorHAnsi" w:eastAsiaTheme="minorHAnsi" w:hAnsiTheme="minorHAnsi" w:cstheme="minorBidi"/>
+          <w:color w:val="auto"/>
+          <w:sz w:val="22"/>
+          <w:szCs w:val="22"/>
+          <w:lang w:val="en-US" w:eastAsia="ca-ES"/>
+        </w:rPr>
+        <w:t xml:space="preserve"> that microhabitat filters will drive differences in the germination traits of species and communities. Sites with prolonged snow cover will </w:t>
+      </w:r>
+      <w:proofErr w:type="spellStart"/>
+      <w:r>
+        <w:rPr>
+          <w:rFonts w:asciiTheme="minorHAnsi" w:eastAsiaTheme="minorHAnsi" w:hAnsiTheme="minorHAnsi" w:cstheme="minorBidi"/>
+          <w:color w:val="auto"/>
+          <w:sz w:val="22"/>
+          <w:szCs w:val="22"/>
+          <w:lang w:val="en-US" w:eastAsia="ca-ES"/>
+        </w:rPr>
+        <w:t>favour</w:t>
+      </w:r>
+      <w:proofErr w:type="spellEnd"/>
+      <w:r>
+        <w:rPr>
+          <w:rFonts w:asciiTheme="minorHAnsi" w:eastAsiaTheme="minorHAnsi" w:hAnsiTheme="minorHAnsi" w:cstheme="minorBidi"/>
+          <w:color w:val="auto"/>
+          <w:sz w:val="22"/>
+          <w:szCs w:val="22"/>
+          <w:lang w:val="en-US" w:eastAsia="ca-ES"/>
+        </w:rPr>
+        <w:t xml:space="preserve"> germination in conditions of low temperature, constant </w:t>
+      </w:r>
+      <w:proofErr w:type="gramStart"/>
+      <w:r>
+        <w:rPr>
+          <w:rFonts w:asciiTheme="minorHAnsi" w:eastAsiaTheme="minorHAnsi" w:hAnsiTheme="minorHAnsi" w:cstheme="minorBidi"/>
+          <w:color w:val="auto"/>
+          <w:sz w:val="22"/>
+          <w:szCs w:val="22"/>
+          <w:lang w:val="en-US" w:eastAsia="ca-ES"/>
+        </w:rPr>
+        <w:t>temperatures</w:t>
+      </w:r>
+      <w:proofErr w:type="gramEnd"/>
+      <w:r>
+        <w:rPr>
+          <w:rFonts w:asciiTheme="minorHAnsi" w:eastAsiaTheme="minorHAnsi" w:hAnsiTheme="minorHAnsi" w:cstheme="minorBidi"/>
+          <w:color w:val="auto"/>
+          <w:sz w:val="22"/>
+          <w:szCs w:val="22"/>
+          <w:lang w:val="en-US" w:eastAsia="ca-ES"/>
+        </w:rPr>
+        <w:t xml:space="preserve"> and darkness. Exposed sites will </w:t>
+      </w:r>
+      <w:proofErr w:type="spellStart"/>
+      <w:r>
+        <w:rPr>
+          <w:rFonts w:asciiTheme="minorHAnsi" w:eastAsiaTheme="minorHAnsi" w:hAnsiTheme="minorHAnsi" w:cstheme="minorBidi"/>
+          <w:color w:val="auto"/>
+          <w:sz w:val="22"/>
+          <w:szCs w:val="22"/>
+          <w:lang w:val="en-US" w:eastAsia="ca-ES"/>
+        </w:rPr>
+        <w:t>favour</w:t>
+      </w:r>
+      <w:proofErr w:type="spellEnd"/>
+      <w:r>
+        <w:rPr>
+          <w:rFonts w:asciiTheme="minorHAnsi" w:eastAsiaTheme="minorHAnsi" w:hAnsiTheme="minorHAnsi" w:cstheme="minorBidi"/>
+          <w:color w:val="auto"/>
+          <w:sz w:val="22"/>
+          <w:szCs w:val="22"/>
+          <w:lang w:val="en-US" w:eastAsia="ca-ES"/>
+        </w:rPr>
+        <w:t xml:space="preserve"> germination after cold-stratification and at high temperatures. However, within communities there will be a dispersion of germination timing traits to </w:t>
+      </w:r>
+      <w:proofErr w:type="spellStart"/>
+      <w:r>
+        <w:rPr>
+          <w:rFonts w:asciiTheme="minorHAnsi" w:eastAsiaTheme="minorHAnsi" w:hAnsiTheme="minorHAnsi" w:cstheme="minorBidi"/>
+          <w:color w:val="auto"/>
+          <w:sz w:val="22"/>
+          <w:szCs w:val="22"/>
+          <w:lang w:val="en-US" w:eastAsia="ca-ES"/>
+        </w:rPr>
+        <w:t>favour</w:t>
+      </w:r>
+      <w:proofErr w:type="spellEnd"/>
+      <w:r>
+        <w:rPr>
+          <w:rFonts w:asciiTheme="minorHAnsi" w:eastAsiaTheme="minorHAnsi" w:hAnsiTheme="minorHAnsi" w:cstheme="minorBidi"/>
+          <w:color w:val="auto"/>
+          <w:sz w:val="22"/>
+          <w:szCs w:val="22"/>
+          <w:lang w:val="en-US" w:eastAsia="ca-ES"/>
+        </w:rPr>
+        <w:t xml:space="preserve"> temporal niche partition, especially in more productive snow-patch communities with deeper soils. According to the co-existence theory of Grubb (1977), niche differentiation may be different between communities with higher versus lower resources and competition (e.g. fellfields versus snowbeds).</w:t>
+      </w:r>
+    </w:p>
+    <w:p>
+      <w:pPr>
+        <w:pStyle w:val="Ttulo2"/>
+        <w:spacing w:after="160" w:line="360" w:lineRule="auto"/>
+        <w:rPr>
+          <w:rFonts w:eastAsia="Times New Roman"/>
+          <w:bdr w:val="none" w:sz="0" w:space="0" w:color="auto" w:frame="1"/>
+          <w:lang w:eastAsia="ca-ES"/>
+        </w:rPr>
+      </w:pPr>
+      <w:r>
+        <w:rPr>
+          <w:rFonts w:eastAsia="Times New Roman"/>
+          <w:bdr w:val="none" w:sz="0" w:space="0" w:color="auto" w:frame="1"/>
+          <w:lang w:eastAsia="ca-ES"/>
+        </w:rPr>
+        <w:t>2. Material and Methods</w:t>
+      </w:r>
+    </w:p>
+    <w:p>
+      <w:pPr>
+        <w:pStyle w:val="Ttulo2"/>
+        <w:spacing w:after="160" w:line="360" w:lineRule="auto"/>
+        <w:rPr>
+          <w:rFonts w:eastAsia="Times New Roman"/>
+          <w:bdr w:val="none" w:sz="0" w:space="0" w:color="auto" w:frame="1"/>
+          <w:lang w:eastAsia="ca-ES"/>
+        </w:rPr>
+      </w:pPr>
+      <w:r>
+        <w:rPr>
+          <w:rFonts w:eastAsia="Times New Roman"/>
+          <w:bdr w:val="none" w:sz="0" w:space="0" w:color="auto" w:frame="1"/>
+          <w:lang w:eastAsia="ca-ES"/>
+        </w:rPr>
+        <w:t xml:space="preserve">2.1 </w:t>
+      </w:r>
+      <w:commentRangeStart w:id="2"/>
+      <w:r>
+        <w:rPr>
+          <w:rFonts w:eastAsia="Times New Roman"/>
+          <w:bdr w:val="none" w:sz="0" w:space="0" w:color="auto" w:frame="1"/>
+          <w:lang w:eastAsia="ca-ES"/>
+        </w:rPr>
+        <w:t>Study system</w:t>
+      </w:r>
+      <w:commentRangeEnd w:id="2"/>
+      <w:r>
+        <w:rPr>
+          <w:rStyle w:val="Refdecomentario"/>
+          <w:rFonts w:ascii="Calibri" w:eastAsia="Calibri" w:hAnsi="Calibri" w:cs="Calibri"/>
+          <w:color w:val="auto"/>
+        </w:rPr>
+        <w:commentReference w:id="2"/>
+      </w:r>
+    </w:p>
+    <w:p>
+      <w:pPr>
+        <w:spacing w:line="360" w:lineRule="auto"/>
+        <w:jc w:val="both"/>
+        <w:rPr>
           <w:rFonts w:cstheme="minorHAnsi"/>
         </w:rPr>
       </w:pPr>
@@ -83,7 +1211,21 @@
         <w:rPr>
           <w:rFonts w:cstheme="minorHAnsi"/>
         </w:rPr>
-        <w:t xml:space="preserve"> communities living between 1900 and 2500 m a.s.l. in the Cantabrian Mountains. This mountain range,  running E-W in northern Spain, is considered a transitional biogeographical hub between Eurosiberian and Mediterranean regions </w:t>
+        <w:t xml:space="preserve"> communities living between 1900 and 2500 m </w:t>
+      </w:r>
+      <w:proofErr w:type="spellStart"/>
+      <w:r>
+        <w:rPr>
+          <w:rFonts w:cstheme="minorHAnsi"/>
+        </w:rPr>
+        <w:t>a.s.l</w:t>
+      </w:r>
+      <w:proofErr w:type="spellEnd"/>
+      <w:r>
+        <w:rPr>
+          <w:rFonts w:cstheme="minorHAnsi"/>
+        </w:rPr>
+        <w:t xml:space="preserve">. in the Cantabrian Mountains. This mountain range,  running E-W in northern Spain, is considered a transitional biogeographical hub between Eurosiberian and Mediterranean regions </w:t>
       </w:r>
       <w:r>
         <w:rPr>
@@ -135,7 +1277,19 @@
         <w:rPr>
           <w:rFonts w:cstheme="minorHAnsi"/>
         </w:rPr>
-        <w:t xml:space="preserve">, influenced by Mediterranean-like climate in southern slopes and temperate climate in northern slopes. The particularity of its geographic location facilitates the coexistence of a complex array of communities with species adapted to both climates. We established one study system </w:t>
+        <w:t xml:space="preserve">, influenced by </w:t>
+      </w:r>
+      <w:r>
+        <w:rPr>
+          <w:rFonts w:cstheme="minorHAnsi"/>
+        </w:rPr>
+        <w:t xml:space="preserve">a </w:t>
+      </w:r>
+      <w:r>
+        <w:rPr>
+          <w:rFonts w:cstheme="minorHAnsi"/>
+        </w:rPr>
+        <w:t xml:space="preserve">Mediterranean-like climate in southern slopes and temperate climate in northern slopes. The particularity of its geographic location facilitates the coexistence of a complex array of communities with species adapted to both climates. We established one study system </w:t>
       </w:r>
       <w:r>
         <w:rPr>
@@ -154,46 +1308,47 @@
           <w:rFonts w:cstheme="minorHAnsi"/>
           <w:highlight w:val="yellow"/>
         </w:rPr>
-        <w:t>Fig.1</w:t>
+        <w:t>Fig.1a</w:t>
+      </w:r>
+      <w:r>
+        <w:rPr>
+          <w:rFonts w:cstheme="minorHAnsi"/>
+        </w:rPr>
+        <w:t xml:space="preserve"> in green); and (2) Mediterranean high mountain acidic grasslands in the Valles de Omaña and Luna Biosphere Reserve (SW of the Cantabrian mountains, </w:t>
       </w:r>
       <w:r>
         <w:rPr>
           <w:rFonts w:cstheme="minorHAnsi"/>
           <w:highlight w:val="yellow"/>
         </w:rPr>
-        <w:t>a</w:t>
+        <w:t>Fig.1a</w:t>
       </w:r>
       <w:r>
         <w:rPr>
           <w:rFonts w:cstheme="minorHAnsi"/>
         </w:rPr>
-        <w:t xml:space="preserve"> in green); and (2) Mediterranean high mountain acidic grasslands in the Valles de Omaña and Luna Biosphere Reserve (SW of the Cantabrian mountains, </w:t>
+        <w:t xml:space="preserve"> in yellow). Alpine </w:t>
       </w:r>
       <w:r>
         <w:rPr>
           <w:rFonts w:cstheme="minorHAnsi"/>
-          <w:highlight w:val="yellow"/>
-        </w:rPr>
-        <w:t>Fig.1a</w:t>
+        </w:rPr>
+        <w:t>grassland</w:t>
       </w:r>
       <w:r>
         <w:rPr>
           <w:rFonts w:cstheme="minorHAnsi"/>
         </w:rPr>
-        <w:t xml:space="preserve"> in yellow). Alpine </w:t>
+        <w:t xml:space="preserve"> communities in </w:t>
       </w:r>
       <w:r>
         <w:rPr>
           <w:rFonts w:cstheme="minorHAnsi"/>
         </w:rPr>
-        <w:t>grassland</w:t>
-      </w:r>
-      <w:r>
-        <w:rPr>
-          <w:rFonts w:cstheme="minorHAnsi"/>
-        </w:rPr>
-        <w:t xml:space="preserve"> communities in the Cantabrian Mountains are dominated mostly by </w:t>
-      </w:r>
+        <w:lastRenderedPageBreak/>
+        <w:t xml:space="preserve">the Cantabrian Mountains are dominated mostly by </w:t>
+      </w:r>
+      <w:proofErr w:type="spellStart"/>
       <w:r>
         <w:rPr>
           <w:rFonts w:cstheme="minorHAnsi"/>
@@ -202,12 +1357,14 @@
         </w:rPr>
         <w:t>Poaceae</w:t>
       </w:r>
+      <w:proofErr w:type="spellEnd"/>
       <w:r>
         <w:rPr>
           <w:rFonts w:cstheme="minorHAnsi"/>
         </w:rPr>
         <w:t xml:space="preserve"> and </w:t>
       </w:r>
+      <w:proofErr w:type="spellStart"/>
       <w:r>
         <w:rPr>
           <w:rFonts w:cstheme="minorHAnsi"/>
@@ -216,6 +1373,7 @@
         </w:rPr>
         <w:t>Cyperaceae</w:t>
       </w:r>
+      <w:proofErr w:type="spellEnd"/>
       <w:r>
         <w:rPr>
           <w:rFonts w:cstheme="minorHAnsi"/>
@@ -234,13 +1392,41 @@
         </w:rPr>
         <w:t xml:space="preserve"> are mainly Hemicryptophytes and Chamaephytes. Grazing impact is restricted to wild populations of Cantabrian chamois (</w:t>
       </w:r>
+      <w:proofErr w:type="spellStart"/>
       <w:r>
         <w:rPr>
           <w:rFonts w:cstheme="minorHAnsi"/>
           <w:i/>
           <w:iCs/>
         </w:rPr>
-        <w:t>Rupricapra pyrenaica parva</w:t>
+        <w:t>Rupricapra</w:t>
+      </w:r>
+      <w:proofErr w:type="spellEnd"/>
+      <w:r>
+        <w:rPr>
+          <w:rFonts w:cstheme="minorHAnsi"/>
+          <w:i/>
+          <w:iCs/>
+        </w:rPr>
+        <w:t xml:space="preserve"> </w:t>
+      </w:r>
+      <w:proofErr w:type="spellStart"/>
+      <w:r>
+        <w:rPr>
+          <w:rFonts w:cstheme="minorHAnsi"/>
+          <w:i/>
+          <w:iCs/>
+        </w:rPr>
+        <w:t>pyrenaica</w:t>
+      </w:r>
+      <w:proofErr w:type="spellEnd"/>
+      <w:r>
+        <w:rPr>
+          <w:rFonts w:cstheme="minorHAnsi"/>
+          <w:i/>
+          <w:iCs/>
+        </w:rPr>
+        <w:t xml:space="preserve"> parva</w:t>
       </w:r>
       <w:r>
         <w:rPr>
@@ -262,7 +1448,83 @@
         <w:rPr>
           <w:rFonts w:cstheme="minorHAnsi"/>
         </w:rPr>
-        <w:t xml:space="preserve">Table 1. System description. Location: coordinates ranges for the center of our four sampling sites). Soil pH based on 40 samples collected in 2018, own data not shown. Mean annual air temperature, based on 47 locations from CHELSA 2.1 (bio1). Growing season length calculated from in situ soil temperature records, start and ending dates based on 3 consecuie days with mean temperature &gt; 5ºC at 5 cm deep in the soil (Körner, 2021). Mean annual soil temperature at 5 cm deep, based on 4 location per system and 3+ years (own data not shown). Summer precipitation, based on 47 locations from CHELSA 2.1 (bio 17). Local richness calculated from floristic relevés recorded in the 80 </w:t>
+        <w:t xml:space="preserve">Table 1. System description. Location: coordinates </w:t>
+      </w:r>
+      <w:r>
+        <w:rPr>
+          <w:rFonts w:cstheme="minorHAnsi"/>
+        </w:rPr>
+        <w:t>range</w:t>
+      </w:r>
+      <w:r>
+        <w:rPr>
+          <w:rFonts w:cstheme="minorHAnsi"/>
+        </w:rPr>
+        <w:t xml:space="preserve"> fr</w:t>
+      </w:r>
+      <w:r>
+        <w:rPr>
+          <w:rFonts w:cstheme="minorHAnsi"/>
+        </w:rPr>
+        <w:t>om</w:t>
+      </w:r>
+      <w:r>
+        <w:rPr>
+          <w:rFonts w:cstheme="minorHAnsi"/>
+        </w:rPr>
+        <w:t xml:space="preserve"> the </w:t>
+      </w:r>
+      <w:proofErr w:type="spellStart"/>
+      <w:r>
+        <w:rPr>
+          <w:rFonts w:cstheme="minorHAnsi"/>
+        </w:rPr>
+        <w:t>center</w:t>
+      </w:r>
+      <w:proofErr w:type="spellEnd"/>
+      <w:r>
+        <w:rPr>
+          <w:rFonts w:cstheme="minorHAnsi"/>
+        </w:rPr>
+        <w:t xml:space="preserve"> of our four sampling sites). Soil pH based on 40 samples collected in 2018, own data not shown. Mean annual air temperature, based on 47 locations from CHELSA 2.1 (bio1). Growing season length calculated from in situ soil temperature records, start and </w:t>
+      </w:r>
+      <w:r>
+        <w:rPr>
+          <w:rFonts w:cstheme="minorHAnsi"/>
+        </w:rPr>
+        <w:t>end</w:t>
+      </w:r>
+      <w:r>
+        <w:rPr>
+          <w:rFonts w:cstheme="minorHAnsi"/>
+        </w:rPr>
+        <w:t xml:space="preserve"> dates based on 3 </w:t>
+      </w:r>
+      <w:r>
+        <w:rPr>
+          <w:rFonts w:cstheme="minorHAnsi"/>
+        </w:rPr>
+        <w:t>consecutive</w:t>
+      </w:r>
+      <w:r>
+        <w:rPr>
+          <w:rFonts w:cstheme="minorHAnsi"/>
+        </w:rPr>
+        <w:t xml:space="preserve"> days with mean temperature &gt; 5ºC at 5 cm deep in the soil (Körner, 2021). Mean annual soil temperature at 5 cm deep, based on 4 location per system and 3+ years (own data not shown). Summer precipitation, based on 47 locations from CHELSA 2.1 (</w:t>
+      </w:r>
+      <w:proofErr w:type="gramStart"/>
+      <w:r>
+        <w:rPr>
+          <w:rFonts w:cstheme="minorHAnsi"/>
+        </w:rPr>
+        <w:t>bio 17</w:t>
+      </w:r>
+      <w:proofErr w:type="gramEnd"/>
+      <w:r>
+        <w:rPr>
+          <w:rFonts w:cstheme="minorHAnsi"/>
+        </w:rPr>
+        <w:t xml:space="preserve">). Local richness calculated from floristic relevés recorded in the 80 </w:t>
       </w:r>
       <w:r>
         <w:rPr>
@@ -389,6 +1651,7 @@
                 <w:lang w:val="es-ES" w:eastAsia="es-ES"/>
               </w:rPr>
             </w:pPr>
+            <w:proofErr w:type="spellStart"/>
             <w:r>
               <w:rPr>
                 <w:rFonts w:ascii="Calibri" w:eastAsia="Times New Roman" w:hAnsi="Calibri" w:cs="Calibri"/>
@@ -397,7 +1660,18 @@
                 <w:szCs w:val="18"/>
                 <w:lang w:val="es-ES" w:eastAsia="es-ES"/>
               </w:rPr>
-              <w:t xml:space="preserve">Temperate </w:t>
+              <w:t>Temperate</w:t>
+            </w:r>
+            <w:proofErr w:type="spellEnd"/>
+            <w:r>
+              <w:rPr>
+                <w:rFonts w:ascii="Calibri" w:eastAsia="Times New Roman" w:hAnsi="Calibri" w:cs="Calibri"/>
+                <w:color w:val="000000"/>
+                <w:sz w:val="18"/>
+                <w:szCs w:val="18"/>
+                <w:lang w:val="es-ES" w:eastAsia="es-ES"/>
+              </w:rPr>
+              <w:t xml:space="preserve"> </w:t>
             </w:r>
           </w:p>
         </w:tc>
@@ -628,6 +1902,7 @@
                 <w:lang w:val="es-ES" w:eastAsia="es-ES"/>
               </w:rPr>
             </w:pPr>
+            <w:proofErr w:type="spellStart"/>
             <w:r>
               <w:rPr>
                 <w:rFonts w:ascii="Calibri" w:eastAsia="Times New Roman" w:hAnsi="Calibri" w:cs="Calibri"/>
@@ -636,7 +1911,18 @@
                 <w:szCs w:val="18"/>
                 <w:lang w:val="es-ES" w:eastAsia="es-ES"/>
               </w:rPr>
-              <w:t xml:space="preserve">Soil pH </w:t>
+              <w:t>Soil</w:t>
+            </w:r>
+            <w:proofErr w:type="spellEnd"/>
+            <w:r>
+              <w:rPr>
+                <w:rFonts w:ascii="Calibri" w:eastAsia="Times New Roman" w:hAnsi="Calibri" w:cs="Calibri"/>
+                <w:color w:val="000000"/>
+                <w:sz w:val="18"/>
+                <w:szCs w:val="18"/>
+                <w:lang w:val="es-ES" w:eastAsia="es-ES"/>
+              </w:rPr>
+              <w:t xml:space="preserve"> pH </w:t>
             </w:r>
           </w:p>
         </w:tc>
@@ -792,8 +2078,20 @@
                 <w:szCs w:val="18"/>
                 <w:lang w:val="es-ES" w:eastAsia="es-ES"/>
               </w:rPr>
-              <w:t>2.5 ºC</w:t>
+              <w:t xml:space="preserve">2.5 </w:t>
             </w:r>
+            <w:proofErr w:type="spellStart"/>
+            <w:r>
+              <w:rPr>
+                <w:rFonts w:ascii="Calibri" w:eastAsia="Times New Roman" w:hAnsi="Calibri" w:cs="Calibri"/>
+                <w:color w:val="000000"/>
+                <w:sz w:val="18"/>
+                <w:szCs w:val="18"/>
+                <w:lang w:val="es-ES" w:eastAsia="es-ES"/>
+              </w:rPr>
+              <w:t>ºC</w:t>
+            </w:r>
+            <w:proofErr w:type="spellEnd"/>
           </w:p>
         </w:tc>
         <w:tc>
@@ -830,8 +2128,20 @@
                 <w:szCs w:val="18"/>
                 <w:lang w:val="es-ES" w:eastAsia="es-ES"/>
               </w:rPr>
-              <w:t>4.5 ºC</w:t>
+              <w:t xml:space="preserve">4.5 </w:t>
             </w:r>
+            <w:proofErr w:type="spellStart"/>
+            <w:r>
+              <w:rPr>
+                <w:rFonts w:ascii="Calibri" w:eastAsia="Times New Roman" w:hAnsi="Calibri" w:cs="Calibri"/>
+                <w:color w:val="000000"/>
+                <w:sz w:val="18"/>
+                <w:szCs w:val="18"/>
+                <w:lang w:val="es-ES" w:eastAsia="es-ES"/>
+              </w:rPr>
+              <w:t>ºC</w:t>
+            </w:r>
+            <w:proofErr w:type="spellEnd"/>
           </w:p>
         </w:tc>
       </w:tr>
@@ -910,8 +2220,42 @@
                 <w:szCs w:val="18"/>
                 <w:lang w:val="es-ES" w:eastAsia="es-ES"/>
               </w:rPr>
-              <w:t>May - early October</w:t>
+              <w:t xml:space="preserve">May - </w:t>
             </w:r>
+            <w:proofErr w:type="spellStart"/>
+            <w:r>
+              <w:rPr>
+                <w:rFonts w:ascii="Calibri" w:eastAsia="Times New Roman" w:hAnsi="Calibri" w:cs="Calibri"/>
+                <w:color w:val="000000"/>
+                <w:sz w:val="18"/>
+                <w:szCs w:val="18"/>
+                <w:lang w:val="es-ES" w:eastAsia="es-ES"/>
+              </w:rPr>
+              <w:t>early</w:t>
+            </w:r>
+            <w:proofErr w:type="spellEnd"/>
+            <w:r>
+              <w:rPr>
+                <w:rFonts w:ascii="Calibri" w:eastAsia="Times New Roman" w:hAnsi="Calibri" w:cs="Calibri"/>
+                <w:color w:val="000000"/>
+                <w:sz w:val="18"/>
+                <w:szCs w:val="18"/>
+                <w:lang w:val="es-ES" w:eastAsia="es-ES"/>
+              </w:rPr>
+              <w:t xml:space="preserve"> </w:t>
+            </w:r>
+            <w:proofErr w:type="spellStart"/>
+            <w:r>
+              <w:rPr>
+                <w:rFonts w:ascii="Calibri" w:eastAsia="Times New Roman" w:hAnsi="Calibri" w:cs="Calibri"/>
+                <w:color w:val="000000"/>
+                <w:sz w:val="18"/>
+                <w:szCs w:val="18"/>
+                <w:lang w:val="es-ES" w:eastAsia="es-ES"/>
+              </w:rPr>
+              <w:t>October</w:t>
+            </w:r>
+            <w:proofErr w:type="spellEnd"/>
           </w:p>
         </w:tc>
         <w:tc>
@@ -947,8 +2291,42 @@
                 <w:szCs w:val="18"/>
                 <w:lang w:val="es-ES" w:eastAsia="es-ES"/>
               </w:rPr>
-              <w:t>March – early November</w:t>
+              <w:t xml:space="preserve">March – </w:t>
             </w:r>
+            <w:proofErr w:type="spellStart"/>
+            <w:r>
+              <w:rPr>
+                <w:rFonts w:ascii="Calibri" w:eastAsia="Times New Roman" w:hAnsi="Calibri" w:cs="Calibri"/>
+                <w:color w:val="000000"/>
+                <w:sz w:val="18"/>
+                <w:szCs w:val="18"/>
+                <w:lang w:val="es-ES" w:eastAsia="es-ES"/>
+              </w:rPr>
+              <w:t>early</w:t>
+            </w:r>
+            <w:proofErr w:type="spellEnd"/>
+            <w:r>
+              <w:rPr>
+                <w:rFonts w:ascii="Calibri" w:eastAsia="Times New Roman" w:hAnsi="Calibri" w:cs="Calibri"/>
+                <w:color w:val="000000"/>
+                <w:sz w:val="18"/>
+                <w:szCs w:val="18"/>
+                <w:lang w:val="es-ES" w:eastAsia="es-ES"/>
+              </w:rPr>
+              <w:t xml:space="preserve"> </w:t>
+            </w:r>
+            <w:proofErr w:type="spellStart"/>
+            <w:r>
+              <w:rPr>
+                <w:rFonts w:ascii="Calibri" w:eastAsia="Times New Roman" w:hAnsi="Calibri" w:cs="Calibri"/>
+                <w:color w:val="000000"/>
+                <w:sz w:val="18"/>
+                <w:szCs w:val="18"/>
+                <w:lang w:val="es-ES" w:eastAsia="es-ES"/>
+              </w:rPr>
+              <w:t>November</w:t>
+            </w:r>
+            <w:proofErr w:type="spellEnd"/>
           </w:p>
         </w:tc>
       </w:tr>
@@ -1027,8 +2405,20 @@
                 <w:szCs w:val="18"/>
                 <w:lang w:val="es-ES" w:eastAsia="es-ES"/>
               </w:rPr>
-              <w:t>5.1 ºC</w:t>
+              <w:t xml:space="preserve">5.1 </w:t>
             </w:r>
+            <w:proofErr w:type="spellStart"/>
+            <w:r>
+              <w:rPr>
+                <w:rFonts w:ascii="Calibri" w:eastAsia="Times New Roman" w:hAnsi="Calibri" w:cs="Calibri"/>
+                <w:color w:val="000000"/>
+                <w:sz w:val="18"/>
+                <w:szCs w:val="18"/>
+                <w:lang w:val="es-ES" w:eastAsia="es-ES"/>
+              </w:rPr>
+              <w:t>ºC</w:t>
+            </w:r>
+            <w:proofErr w:type="spellEnd"/>
           </w:p>
         </w:tc>
         <w:tc>
@@ -1065,8 +2455,20 @@
                 <w:szCs w:val="18"/>
                 <w:lang w:val="es-ES" w:eastAsia="es-ES"/>
               </w:rPr>
-              <w:t>8.1 ºC</w:t>
+              <w:t xml:space="preserve">8.1 </w:t>
             </w:r>
+            <w:proofErr w:type="spellStart"/>
+            <w:r>
+              <w:rPr>
+                <w:rFonts w:ascii="Calibri" w:eastAsia="Times New Roman" w:hAnsi="Calibri" w:cs="Calibri"/>
+                <w:color w:val="000000"/>
+                <w:sz w:val="18"/>
+                <w:szCs w:val="18"/>
+                <w:lang w:val="es-ES" w:eastAsia="es-ES"/>
+              </w:rPr>
+              <w:t>ºC</w:t>
+            </w:r>
+            <w:proofErr w:type="spellEnd"/>
           </w:p>
         </w:tc>
       </w:tr>
@@ -1283,8 +2685,20 @@
                 <w:szCs w:val="18"/>
                 <w:lang w:val="es-ES" w:eastAsia="es-ES"/>
               </w:rPr>
-              <w:t>8 - 18 species</w:t>
+              <w:t xml:space="preserve">8 - 18 </w:t>
             </w:r>
+            <w:proofErr w:type="spellStart"/>
+            <w:r>
+              <w:rPr>
+                <w:rFonts w:ascii="Calibri" w:eastAsia="Times New Roman" w:hAnsi="Calibri" w:cs="Calibri"/>
+                <w:color w:val="000000"/>
+                <w:sz w:val="18"/>
+                <w:szCs w:val="18"/>
+                <w:lang w:val="es-ES" w:eastAsia="es-ES"/>
+              </w:rPr>
+              <w:t>species</w:t>
+            </w:r>
+            <w:proofErr w:type="spellEnd"/>
           </w:p>
         </w:tc>
         <w:tc>
@@ -1321,8 +2735,20 @@
                 <w:szCs w:val="18"/>
                 <w:lang w:val="es-ES" w:eastAsia="es-ES"/>
               </w:rPr>
-              <w:t>3 - 14 species</w:t>
+              <w:t xml:space="preserve">3 - 14 </w:t>
             </w:r>
+            <w:proofErr w:type="spellStart"/>
+            <w:r>
+              <w:rPr>
+                <w:rFonts w:ascii="Calibri" w:eastAsia="Times New Roman" w:hAnsi="Calibri" w:cs="Calibri"/>
+                <w:color w:val="000000"/>
+                <w:sz w:val="18"/>
+                <w:szCs w:val="18"/>
+                <w:lang w:val="es-ES" w:eastAsia="es-ES"/>
+              </w:rPr>
+              <w:t>species</w:t>
+            </w:r>
+            <w:proofErr w:type="spellEnd"/>
           </w:p>
         </w:tc>
       </w:tr>
@@ -1394,6 +2820,7 @@
                 <w:lang w:val="es-ES" w:eastAsia="es-ES"/>
               </w:rPr>
             </w:pPr>
+            <w:proofErr w:type="spellStart"/>
             <w:r>
               <w:rPr>
                 <w:rFonts w:ascii="Calibri" w:eastAsia="Times New Roman" w:hAnsi="Calibri" w:cs="Calibri"/>
@@ -1404,8 +2831,35 @@
                 <w:szCs w:val="18"/>
                 <w:lang w:val="es-ES" w:eastAsia="es-ES"/>
               </w:rPr>
-              <w:t>Carex sempervirens</w:t>
+              <w:t>Carex</w:t>
             </w:r>
+            <w:proofErr w:type="spellEnd"/>
+            <w:r>
+              <w:rPr>
+                <w:rFonts w:ascii="Calibri" w:eastAsia="Times New Roman" w:hAnsi="Calibri" w:cs="Calibri"/>
+                <w:i/>
+                <w:iCs/>
+                <w:color w:val="000000"/>
+                <w:sz w:val="18"/>
+                <w:szCs w:val="18"/>
+                <w:lang w:val="es-ES" w:eastAsia="es-ES"/>
+              </w:rPr>
+              <w:t xml:space="preserve"> </w:t>
+            </w:r>
+            <w:proofErr w:type="spellStart"/>
+            <w:r>
+              <w:rPr>
+                <w:rFonts w:ascii="Calibri" w:eastAsia="Times New Roman" w:hAnsi="Calibri" w:cs="Calibri"/>
+                <w:i/>
+                <w:iCs/>
+                <w:color w:val="000000"/>
+                <w:sz w:val="18"/>
+                <w:szCs w:val="18"/>
+                <w:lang w:val="es-ES" w:eastAsia="es-ES"/>
+              </w:rPr>
+              <w:t>sempervirens</w:t>
+            </w:r>
+            <w:proofErr w:type="spellEnd"/>
             <w:r>
               <w:rPr>
                 <w:rFonts w:ascii="Calibri" w:eastAsia="Times New Roman" w:hAnsi="Calibri" w:cs="Calibri"/>
@@ -1455,7 +2909,33 @@
                 <w:szCs w:val="18"/>
                 <w:lang w:val="es-ES" w:eastAsia="es-ES"/>
               </w:rPr>
-              <w:t xml:space="preserve">Luzula caespitosa </w:t>
+              <w:t xml:space="preserve">Luzula </w:t>
+            </w:r>
+            <w:proofErr w:type="spellStart"/>
+            <w:r>
+              <w:rPr>
+                <w:rFonts w:ascii="Calibri" w:eastAsia="Times New Roman" w:hAnsi="Calibri" w:cs="Calibri"/>
+                <w:i/>
+                <w:iCs/>
+                <w:color w:val="000000"/>
+                <w:sz w:val="18"/>
+                <w:szCs w:val="18"/>
+                <w:lang w:val="es-ES" w:eastAsia="es-ES"/>
+              </w:rPr>
+              <w:t>caespitosa</w:t>
+            </w:r>
+            <w:proofErr w:type="spellEnd"/>
+            <w:r>
+              <w:rPr>
+                <w:rFonts w:ascii="Calibri" w:eastAsia="Times New Roman" w:hAnsi="Calibri" w:cs="Calibri"/>
+                <w:i/>
+                <w:iCs/>
+                <w:color w:val="000000"/>
+                <w:sz w:val="18"/>
+                <w:szCs w:val="18"/>
+                <w:lang w:val="es-ES" w:eastAsia="es-ES"/>
+              </w:rPr>
+              <w:t xml:space="preserve"> </w:t>
             </w:r>
             <w:r>
               <w:rPr>
@@ -1537,7 +3017,33 @@
                 <w:szCs w:val="18"/>
                 <w:lang w:val="es-ES" w:eastAsia="es-ES"/>
               </w:rPr>
-              <w:t xml:space="preserve">Silene acaulis (6.46 </w:t>
+              <w:t xml:space="preserve">Silene </w:t>
+            </w:r>
+            <w:proofErr w:type="spellStart"/>
+            <w:r>
+              <w:rPr>
+                <w:rFonts w:ascii="Calibri" w:eastAsia="Times New Roman" w:hAnsi="Calibri" w:cs="Calibri"/>
+                <w:i/>
+                <w:iCs/>
+                <w:color w:val="000000"/>
+                <w:sz w:val="18"/>
+                <w:szCs w:val="18"/>
+                <w:lang w:val="es-ES" w:eastAsia="es-ES"/>
+              </w:rPr>
+              <w:t>acaulis</w:t>
+            </w:r>
+            <w:proofErr w:type="spellEnd"/>
+            <w:r>
+              <w:rPr>
+                <w:rFonts w:ascii="Calibri" w:eastAsia="Times New Roman" w:hAnsi="Calibri" w:cs="Calibri"/>
+                <w:i/>
+                <w:iCs/>
+                <w:color w:val="000000"/>
+                <w:sz w:val="18"/>
+                <w:szCs w:val="18"/>
+                <w:lang w:val="es-ES" w:eastAsia="es-ES"/>
+              </w:rPr>
+              <w:t xml:space="preserve"> (6.46 </w:t>
             </w:r>
             <w:r>
               <w:rPr>
@@ -1578,6 +3084,7 @@
                 <w:lang w:val="es-ES" w:eastAsia="es-ES"/>
               </w:rPr>
             </w:pPr>
+            <w:proofErr w:type="spellStart"/>
             <w:r>
               <w:rPr>
                 <w:rFonts w:ascii="Calibri" w:eastAsia="Times New Roman" w:hAnsi="Calibri" w:cs="Calibri"/>
@@ -1588,7 +3095,46 @@
                 <w:szCs w:val="18"/>
                 <w:lang w:val="es-ES" w:eastAsia="es-ES"/>
               </w:rPr>
-              <w:t xml:space="preserve">Festuca summilusitana </w:t>
+              <w:t>Festuca</w:t>
+            </w:r>
+            <w:proofErr w:type="spellEnd"/>
+            <w:r>
+              <w:rPr>
+                <w:rFonts w:ascii="Calibri" w:eastAsia="Times New Roman" w:hAnsi="Calibri" w:cs="Calibri"/>
+                <w:i/>
+                <w:iCs/>
+                <w:color w:val="000000"/>
+                <w:sz w:val="18"/>
+                <w:szCs w:val="18"/>
+                <w:lang w:val="es-ES" w:eastAsia="es-ES"/>
+              </w:rPr>
+              <w:t xml:space="preserve"> </w:t>
+            </w:r>
+            <w:proofErr w:type="spellStart"/>
+            <w:r>
+              <w:rPr>
+                <w:rFonts w:ascii="Calibri" w:eastAsia="Times New Roman" w:hAnsi="Calibri" w:cs="Calibri"/>
+                <w:i/>
+                <w:iCs/>
+                <w:color w:val="000000"/>
+                <w:sz w:val="18"/>
+                <w:szCs w:val="18"/>
+                <w:lang w:val="es-ES" w:eastAsia="es-ES"/>
+              </w:rPr>
+              <w:t>summilusitana</w:t>
+            </w:r>
+            <w:proofErr w:type="spellEnd"/>
+            <w:r>
+              <w:rPr>
+                <w:rFonts w:ascii="Calibri" w:eastAsia="Times New Roman" w:hAnsi="Calibri" w:cs="Calibri"/>
+                <w:i/>
+                <w:iCs/>
+                <w:color w:val="000000"/>
+                <w:sz w:val="18"/>
+                <w:szCs w:val="18"/>
+                <w:lang w:val="es-ES" w:eastAsia="es-ES"/>
+              </w:rPr>
+              <w:t xml:space="preserve"> </w:t>
             </w:r>
             <w:r>
               <w:rPr>
@@ -1660,6 +3206,7 @@
                 <w:lang w:val="es-ES" w:eastAsia="es-ES"/>
               </w:rPr>
             </w:pPr>
+            <w:proofErr w:type="spellStart"/>
             <w:r>
               <w:rPr>
                 <w:rFonts w:ascii="Calibri" w:eastAsia="Times New Roman" w:hAnsi="Calibri" w:cs="Calibri"/>
@@ -1670,8 +3217,35 @@
                 <w:szCs w:val="18"/>
                 <w:lang w:val="es-ES" w:eastAsia="es-ES"/>
               </w:rPr>
-              <w:t>Helianthemum urrielense</w:t>
+              <w:t>Helianthemum</w:t>
             </w:r>
+            <w:proofErr w:type="spellEnd"/>
+            <w:r>
+              <w:rPr>
+                <w:rFonts w:ascii="Calibri" w:eastAsia="Times New Roman" w:hAnsi="Calibri" w:cs="Calibri"/>
+                <w:i/>
+                <w:iCs/>
+                <w:color w:val="000000"/>
+                <w:sz w:val="18"/>
+                <w:szCs w:val="18"/>
+                <w:lang w:val="es-ES" w:eastAsia="es-ES"/>
+              </w:rPr>
+              <w:t xml:space="preserve"> </w:t>
+            </w:r>
+            <w:proofErr w:type="spellStart"/>
+            <w:r>
+              <w:rPr>
+                <w:rFonts w:ascii="Calibri" w:eastAsia="Times New Roman" w:hAnsi="Calibri" w:cs="Calibri"/>
+                <w:i/>
+                <w:iCs/>
+                <w:color w:val="000000"/>
+                <w:sz w:val="18"/>
+                <w:szCs w:val="18"/>
+                <w:lang w:val="es-ES" w:eastAsia="es-ES"/>
+              </w:rPr>
+              <w:t>urrielense</w:t>
+            </w:r>
+            <w:proofErr w:type="spellEnd"/>
             <w:r>
               <w:rPr>
                 <w:rFonts w:ascii="Calibri" w:eastAsia="Times New Roman" w:hAnsi="Calibri" w:cs="Calibri"/>
@@ -1711,6 +3285,7 @@
                 <w:lang w:val="es-ES" w:eastAsia="es-ES"/>
               </w:rPr>
             </w:pPr>
+            <w:proofErr w:type="spellStart"/>
             <w:r>
               <w:rPr>
                 <w:rFonts w:ascii="Calibri" w:eastAsia="Times New Roman" w:hAnsi="Calibri" w:cs="Calibri"/>
@@ -1721,7 +3296,20 @@
                 <w:szCs w:val="18"/>
                 <w:lang w:val="es-ES" w:eastAsia="es-ES"/>
               </w:rPr>
-              <w:t>Minuartia recurva</w:t>
+              <w:t>Minuartia</w:t>
+            </w:r>
+            <w:proofErr w:type="spellEnd"/>
+            <w:r>
+              <w:rPr>
+                <w:rFonts w:ascii="Calibri" w:eastAsia="Times New Roman" w:hAnsi="Calibri" w:cs="Calibri"/>
+                <w:i/>
+                <w:iCs/>
+                <w:color w:val="000000"/>
+                <w:sz w:val="18"/>
+                <w:szCs w:val="18"/>
+                <w:lang w:val="es-ES" w:eastAsia="es-ES"/>
+              </w:rPr>
+              <w:t xml:space="preserve"> recurva</w:t>
             </w:r>
             <w:r>
               <w:rPr>
@@ -1753,8 +3341,268 @@
         <w:spacing w:line="360" w:lineRule="auto"/>
       </w:pPr>
       <w:r>
-        <w:lastRenderedPageBreak/>
         <w:t>2.2 Environmental gradients</w:t>
+      </w:r>
+    </w:p>
+    <w:p>
+      <w:pPr>
+        <w:spacing w:line="360" w:lineRule="auto"/>
+        <w:jc w:val="both"/>
+      </w:pPr>
+      <w:r>
+        <w:rPr>
+          <w:rFonts w:eastAsia="Times New Roman" w:cstheme="minorHAnsi"/>
+          <w:color w:val="000000"/>
+          <w:lang w:eastAsia="ca-ES"/>
+        </w:rPr>
+        <w:t>Within each system we established four seed sampling sites, separated at least 500 m</w:t>
+      </w:r>
+      <w:r>
+        <w:t>. To measure the spatial microenvironmental gradients</w:t>
+      </w:r>
+      <w:r>
+        <w:t>,</w:t>
+      </w:r>
+      <w:r>
+        <w:t xml:space="preserve"> we established 20 additional plots </w:t>
+      </w:r>
+      <w:r>
+        <w:t>(1m</w:t>
+      </w:r>
+      <w:r>
+        <w:rPr>
+          <w:vertAlign w:val="superscript"/>
+        </w:rPr>
+        <w:t>2</w:t>
+      </w:r>
+      <w:r>
+        <w:t>)</w:t>
+      </w:r>
+      <w:r>
+        <w:t xml:space="preserve"> per each sampling site, five plots in each cardinal direction with a 10 m separation (</w:t>
+      </w:r>
+      <w:r>
+        <w:rPr>
+          <w:highlight w:val="yellow"/>
+        </w:rPr>
+        <w:t>cross design, fig x</w:t>
+      </w:r>
+      <w:r>
+        <w:t>). Here, we also did floristic relevés</w:t>
+      </w:r>
+      <w:r>
+        <w:t xml:space="preserve"> </w:t>
+      </w:r>
+      <w:r>
+        <w:t>identifying all vascular plants and estimating their relative cover in %</w:t>
+      </w:r>
+      <w:r>
+        <w:t xml:space="preserve"> (dominant species in table 1)</w:t>
+      </w:r>
+      <w:r>
+        <w:t xml:space="preserve">.  At the </w:t>
+      </w:r>
+      <w:r>
+        <w:t>centre</w:t>
+      </w:r>
+      <w:r>
+        <w:t xml:space="preserve"> of these addition</w:t>
+      </w:r>
+      <w:r>
+        <w:t>al</w:t>
+      </w:r>
+      <w:r>
+        <w:t xml:space="preserve"> plots</w:t>
+      </w:r>
+      <w:r>
+        <w:t>,</w:t>
+      </w:r>
+      <w:r>
+        <w:t xml:space="preserve"> we</w:t>
+      </w:r>
+      <w:r>
+        <w:t xml:space="preserve"> burie</w:t>
+      </w:r>
+      <w:r>
+        <w:t>d</w:t>
+      </w:r>
+      <w:r>
+        <w:t xml:space="preserve"> at 5 cm deep, </w:t>
+      </w:r>
+      <w:proofErr w:type="spellStart"/>
+      <w:r>
+        <w:t>iButton</w:t>
+      </w:r>
+      <w:proofErr w:type="spellEnd"/>
+      <w:r>
+        <w:t xml:space="preserve"> dataloggers (</w:t>
+      </w:r>
+      <w:proofErr w:type="spellStart"/>
+      <w:r>
+        <w:rPr>
+          <w:rFonts w:eastAsiaTheme="majorEastAsia"/>
+        </w:rPr>
+        <w:t>Thermochron</w:t>
+      </w:r>
+      <w:proofErr w:type="spellEnd"/>
+      <w:r>
+        <w:rPr>
+          <w:rFonts w:eastAsiaTheme="majorEastAsia"/>
+        </w:rPr>
+        <w:t xml:space="preserve">, </w:t>
+      </w:r>
+      <w:proofErr w:type="spellStart"/>
+      <w:r>
+        <w:rPr>
+          <w:rFonts w:eastAsiaTheme="majorEastAsia"/>
+        </w:rPr>
+        <w:t>iButton</w:t>
+      </w:r>
+      <w:proofErr w:type="spellEnd"/>
+      <w:r>
+        <w:rPr>
+          <w:rFonts w:eastAsiaTheme="majorEastAsia"/>
+        </w:rPr>
+        <w:t>, Newbury, UK; accuracy: +/- 0.5 ºC from -10 ºC to +65 ºC, resolution: 0.5 ºC, records every four hours</w:t>
+      </w:r>
+      <w:r>
+        <w:t xml:space="preserve">). </w:t>
+      </w:r>
+      <w:r>
+        <w:t xml:space="preserve">In the temperate system the </w:t>
+      </w:r>
+      <w:proofErr w:type="spellStart"/>
+      <w:r>
+        <w:t>iButtons</w:t>
+      </w:r>
+      <w:proofErr w:type="spellEnd"/>
+      <w:r>
+        <w:t xml:space="preserve"> recording period when </w:t>
+      </w:r>
+      <w:r>
+        <w:rPr>
+          <w:u w:val="single"/>
+        </w:rPr>
+        <w:t>from 1</w:t>
+      </w:r>
+      <w:r>
+        <w:rPr>
+          <w:u w:val="single"/>
+          <w:vertAlign w:val="superscript"/>
+        </w:rPr>
+        <w:t>st</w:t>
+      </w:r>
+      <w:r>
+        <w:rPr>
+          <w:u w:val="single"/>
+        </w:rPr>
+        <w:t xml:space="preserve"> October 2018 to 31</w:t>
+      </w:r>
+      <w:r>
+        <w:rPr>
+          <w:u w:val="single"/>
+          <w:vertAlign w:val="superscript"/>
+        </w:rPr>
+        <w:t>st</w:t>
+      </w:r>
+      <w:r>
+        <w:rPr>
+          <w:u w:val="single"/>
+        </w:rPr>
+        <w:t xml:space="preserve"> August 2019</w:t>
+      </w:r>
+      <w:r>
+        <w:t xml:space="preserve"> (330 days). </w:t>
+      </w:r>
+      <w:r>
+        <w:t xml:space="preserve">The recording period for the </w:t>
+      </w:r>
+      <w:proofErr w:type="spellStart"/>
+      <w:r>
+        <w:t>iButtons</w:t>
+      </w:r>
+      <w:proofErr w:type="spellEnd"/>
+      <w:r>
+        <w:t xml:space="preserve"> </w:t>
+      </w:r>
+      <w:r>
+        <w:rPr>
+          <w:u w:val="single"/>
+        </w:rPr>
+        <w:t>went from 12</w:t>
+      </w:r>
+      <w:r>
+        <w:rPr>
+          <w:u w:val="single"/>
+          <w:vertAlign w:val="superscript"/>
+        </w:rPr>
+        <w:t>th</w:t>
+      </w:r>
+      <w:r>
+        <w:rPr>
+          <w:u w:val="single"/>
+        </w:rPr>
+        <w:t xml:space="preserve"> July 2021 to 29</w:t>
+      </w:r>
+      <w:r>
+        <w:rPr>
+          <w:u w:val="single"/>
+          <w:vertAlign w:val="superscript"/>
+        </w:rPr>
+        <w:t>th</w:t>
+      </w:r>
+      <w:r>
+        <w:rPr>
+          <w:u w:val="single"/>
+        </w:rPr>
+        <w:t xml:space="preserve"> May 2022</w:t>
+      </w:r>
+      <w:r>
+        <w:t xml:space="preserve"> (321 days)</w:t>
+      </w:r>
+      <w:r>
+        <w:t xml:space="preserve"> in the Mediterranean system</w:t>
+      </w:r>
+      <w:r>
+        <w:t>. In total, we collected floristic data from 8</w:t>
+      </w:r>
+      <w:r>
+        <w:t>0</w:t>
+      </w:r>
+      <w:r>
+        <w:t xml:space="preserve"> plots </w:t>
+      </w:r>
+      <w:r>
+        <w:t xml:space="preserve">per system. Not all </w:t>
+      </w:r>
+      <w:proofErr w:type="spellStart"/>
+      <w:r>
+        <w:t>iButtons</w:t>
+      </w:r>
+      <w:proofErr w:type="spellEnd"/>
+      <w:r>
+        <w:t xml:space="preserve"> could be recovered, thus we obtained</w:t>
+      </w:r>
+      <w:r>
+        <w:t xml:space="preserve"> environmental data from 7</w:t>
+      </w:r>
+      <w:r>
+        <w:t>5</w:t>
+      </w:r>
+      <w:r>
+        <w:t xml:space="preserve"> </w:t>
+      </w:r>
+      <w:r>
+        <w:t xml:space="preserve">and 78 plots </w:t>
+      </w:r>
+      <w:r>
+        <w:t>(</w:t>
+      </w:r>
+      <w:r>
+        <w:t>in the Mediterranean and Temperate system, respectively</w:t>
+      </w:r>
+      <w:r>
+        <w:t>).</w:t>
       </w:r>
     </w:p>
     <w:p>
@@ -1764,171 +3612,51 @@
         <w:jc w:val="both"/>
       </w:pPr>
       <w:r>
-        <w:rPr>
-          <w:rFonts w:eastAsia="Times New Roman" w:cstheme="minorHAnsi"/>
-          <w:color w:val="000000"/>
-          <w:lang w:eastAsia="ca-ES"/>
-        </w:rPr>
-        <w:t>Within each system we established four seed sampling sites, separated at least 500 m</w:t>
-      </w:r>
-      <w:r>
-        <w:t>. To measure the spatial microenvironmental gradients</w:t>
+        <w:lastRenderedPageBreak/>
+        <w:t>From the environmental data</w:t>
       </w:r>
       <w:r>
         <w:t>,</w:t>
       </w:r>
       <w:r>
-        <w:t xml:space="preserve"> we established 20 additional plots </w:t>
-      </w:r>
-      <w:r>
-        <w:t>(1m</w:t>
-      </w:r>
-      <w:r>
-        <w:rPr>
-          <w:vertAlign w:val="superscript"/>
-        </w:rPr>
-        <w:t>2</w:t>
-      </w:r>
-      <w:r>
-        <w:t>)</w:t>
-      </w:r>
-      <w:r>
-        <w:t xml:space="preserve"> per each sampling site, five plots in each cardinal direction with a 10 m separation (</w:t>
+        <w:t xml:space="preserve"> we calculated a series of bioclimatic indices per plot following </w:t>
       </w:r>
       <w:r>
         <w:rPr>
           <w:highlight w:val="yellow"/>
         </w:rPr>
-        <w:t>cross design, fig x</w:t>
-      </w:r>
-      <w:r>
-        <w:t>). Here, we also did floristic relevés</w:t>
-      </w:r>
-      <w:r>
-        <w:t xml:space="preserve"> </w:t>
-      </w:r>
-      <w:r>
-        <w:t>identifying all vascular plants and estimating their relative cover in %</w:t>
-      </w:r>
-      <w:r>
-        <w:t xml:space="preserve"> (dominant species in table 1)</w:t>
-      </w:r>
-      <w:r>
-        <w:t xml:space="preserve">.  At the </w:t>
-      </w:r>
-      <w:r>
-        <w:t>centre</w:t>
-      </w:r>
-      <w:r>
-        <w:t xml:space="preserve"> of these addition</w:t>
-      </w:r>
-      <w:r>
-        <w:t>al</w:t>
-      </w:r>
-      <w:r>
-        <w:t xml:space="preserve"> plots</w:t>
-      </w:r>
-      <w:r>
-        <w:t>,</w:t>
-      </w:r>
-      <w:r>
-        <w:t xml:space="preserve"> we</w:t>
-      </w:r>
-      <w:r>
-        <w:t xml:space="preserve"> burie</w:t>
-      </w:r>
-      <w:r>
-        <w:t>d</w:t>
-      </w:r>
-      <w:r>
-        <w:t xml:space="preserve"> at 5 cm deep, iButton dataloggers (</w:t>
-      </w:r>
-      <w:r>
-        <w:rPr>
-          <w:rFonts w:eastAsiaTheme="majorEastAsia"/>
-        </w:rPr>
-        <w:t>Thermochron, iButton, Newbury, UK; accuracy: +/- 0.5 ºC from -10 ºC to +65 ºC, resolution: 0.5 ºC, records every four hours</w:t>
+        <w:t>Jiménez-Alfaro et al. (2024, JVA</w:t>
       </w:r>
       <w:r>
         <w:t xml:space="preserve">). </w:t>
       </w:r>
-      <w:r>
-        <w:t>In the temperate system the iButtons recording period when from 1</w:t>
-      </w:r>
-      <w:r>
-        <w:rPr>
-          <w:vertAlign w:val="superscript"/>
-        </w:rPr>
-        <w:t>st</w:t>
-      </w:r>
-      <w:r>
-        <w:t xml:space="preserve"> October 2018 to 31</w:t>
-      </w:r>
-      <w:r>
-        <w:rPr>
-          <w:vertAlign w:val="superscript"/>
-        </w:rPr>
-        <w:t>st</w:t>
-      </w:r>
-      <w:r>
-        <w:t xml:space="preserve"> August 2019 (330 days). </w:t>
-      </w:r>
-      <w:r>
-        <w:t>The recording period for the iButtons went from 12</w:t>
-      </w:r>
-      <w:r>
-        <w:rPr>
-          <w:vertAlign w:val="superscript"/>
-        </w:rPr>
-        <w:t>th</w:t>
-      </w:r>
-      <w:r>
-        <w:t xml:space="preserve"> July 2021 to 29</w:t>
-      </w:r>
-      <w:r>
-        <w:rPr>
-          <w:vertAlign w:val="superscript"/>
-        </w:rPr>
-        <w:t>th</w:t>
-      </w:r>
-      <w:r>
-        <w:t xml:space="preserve"> May 2022 (321 days)</w:t>
-      </w:r>
-      <w:r>
-        <w:t xml:space="preserve"> in the Mediterranean system</w:t>
-      </w:r>
-      <w:r>
-        <w:t>. In total, we collected floristic data from 8</w:t>
-      </w:r>
-      <w:r>
-        <w:t>0</w:t>
-      </w:r>
-      <w:r>
-        <w:t xml:space="preserve"> plots </w:t>
-      </w:r>
-      <w:r>
-        <w:t>per system. Not all iButtons could be recovered, thus we obtained</w:t>
-      </w:r>
-      <w:r>
-        <w:t xml:space="preserve"> environmental data from 7</w:t>
-      </w:r>
-      <w:r>
-        <w:t>5</w:t>
-      </w:r>
-      <w:r>
-        <w:t xml:space="preserve"> </w:t>
-      </w:r>
-      <w:r>
-        <w:t xml:space="preserve">and 78 plots </w:t>
-      </w:r>
-      <w:r>
-        <w:t>(</w:t>
-      </w:r>
-      <w:r>
-        <w:t>in the Mediterranean and Temperate system, respectively</w:t>
-      </w:r>
-      <w:r>
-        <w:t>).</w:t>
+      <w:commentRangeStart w:id="3"/>
+      <w:r>
+        <w:t xml:space="preserve">We calculated bioclimatic indices based on standard variables used by </w:t>
+      </w:r>
+      <w:proofErr w:type="spellStart"/>
+      <w:r>
+        <w:t>WorldClim</w:t>
+      </w:r>
+      <w:proofErr w:type="spellEnd"/>
+      <w:r>
+        <w:t xml:space="preserve"> (Fick &amp; </w:t>
+      </w:r>
+      <w:proofErr w:type="spellStart"/>
+      <w:r>
+        <w:t>Hijmans</w:t>
+      </w:r>
+      <w:proofErr w:type="spellEnd"/>
+      <w:r>
+        <w:t xml:space="preserve"> 2017), together with other variables with a relevant function on alpine topographic gradients. The selected variables were: (1) bio1 = annual mean temperature; (2) bio2 = mean diurnal range, i.e. the mean of the monthly differences between maximum and minimum temperatures; (3) bio7 = temperature annual range; i.e. the difference between the maximum temperature of the warmest month and the minimum temperature of the coldest month; (4) snow = the number of days of snow cover, when temperature is around 0 ºC, calculated for the period in which the maximum temperature was &lt; 0.5 ºC and the minimum temperature was &gt; -0.5 ºC; (5) FDD = freezing degree days, i.e. the sum of daily mean temperatures for days in which the mean temperature was below 0 ºC (Choler 2018); and (6) GDD = growing degree days, i.e. the sum of daily mean temperatures for days in which the soil mean temperature at five cm deep was above 5 ºC (Körner 2021). For FDD, we transformed the values from negative to positive, so higher values represent more freezing.</w:t>
+      </w:r>
+      <w:commentRangeEnd w:id="3"/>
+      <w:r>
+        <w:rPr>
+          <w:rStyle w:val="Refdecomentario"/>
+          <w:rFonts w:ascii="Calibri" w:eastAsia="Calibri" w:hAnsi="Calibri" w:cs="Calibri"/>
+        </w:rPr>
+        <w:commentReference w:id="3"/>
       </w:r>
     </w:p>
     <w:p>
@@ -1938,62 +3666,106 @@
         <w:jc w:val="both"/>
       </w:pPr>
       <w:r>
-        <w:t xml:space="preserve">From the environmental data we calculated a series of bioclimatic indices per plot following </w:t>
-      </w:r>
-      <w:r>
-        <w:rPr>
-          <w:highlight w:val="yellow"/>
-        </w:rPr>
-        <w:t>Jiménez-Alfaro et al. (2024, JVA</w:t>
-      </w:r>
-      <w:r>
-        <w:t xml:space="preserve">). </w:t>
-      </w:r>
-      <w:commentRangeStart w:id="1"/>
-      <w:r>
-        <w:t>We calculated bioclimatic indices based on standard variables used by WorldClim (Fick &amp; Hijmans 2017), together with other variables with a relevant function on alpine topographic gradients. The selected variables were: (1) bio1 = annual mean temperature; (2) bio2 = mean diurnal range, i.e. the mean of the monthly differences between maximum and minimum temperatures; (3) bio7 = temperature annual range; i.e. the difference between the maximum temperature of the warmest month and the minimum temperature of the coldest month; (4) snow = the number of days of snow cover, when temperature is around 0 ºC, calculated for the period in which the maximum temperature was &lt; 0.5 ºC and the minimum temperature was &gt; -0.5 ºC; (5) FDD = freezing degree days, i.e. the sum of daily mean temperatures for days in which the mean temperature was below 0 ºC (Choler 2018); and (6) GDD = growing degree days, i.e. the sum of daily mean temperatures for days in which the soil mean temperature at five cm deep was above 5 ºC (Körner 2021). For FDD, we transformed the values from negative to positive, so higher values represent more freezing.</w:t>
-      </w:r>
-      <w:commentRangeEnd w:id="1"/>
-      <w:r>
-        <w:rPr>
-          <w:rStyle w:val="Refdecomentario"/>
-          <w:rFonts w:ascii="Calibri" w:eastAsia="Calibri" w:hAnsi="Calibri" w:cs="Calibri"/>
-        </w:rPr>
-        <w:commentReference w:id="1"/>
+        <w:t>We then used the floristic relevés and the bioclimatic indices calculated to estimate species climatic preferences (adult plants realized niche</w:t>
+      </w:r>
+      <w:r>
+        <w:t>/species niche centroids</w:t>
+      </w:r>
+      <w:r>
+        <w:t>). For that purpose, we considered only</w:t>
+      </w:r>
+      <w:r>
+        <w:t xml:space="preserve"> the environmental data of the</w:t>
+      </w:r>
+      <w:r>
+        <w:t xml:space="preserve"> plots where the species had at least 10% coverage and the climatic indices were weighted per </w:t>
+      </w:r>
+      <w:r>
+        <w:t xml:space="preserve">each species </w:t>
+      </w:r>
+      <w:r>
+        <w:t xml:space="preserve">coverage. </w:t>
+      </w:r>
+      <w:r>
+        <w:t>To identify main gradients of species climatic preferences we conducted a principal component analysis (PCA) with the full set of bioclimatic indices</w:t>
+      </w:r>
+      <w:r>
+        <w:t xml:space="preserve"> (fig xx)</w:t>
+      </w:r>
+      <w:r>
+        <w:t>.</w:t>
       </w:r>
     </w:p>
     <w:p>
       <w:pPr>
         <w:spacing w:line="360" w:lineRule="auto"/>
-        <w:ind w:firstLine="709"/>
-      </w:pPr>
-      <w:r>
-        <w:t>We then used the floristic relevés and the bioclimatic indices calculated to estimate species climatic preferences (adult plants realized niche). For that purpose, we considered only</w:t>
-      </w:r>
-      <w:r>
-        <w:t xml:space="preserve"> the environmental data of the</w:t>
-      </w:r>
-      <w:r>
-        <w:t xml:space="preserve"> plots where the species had at least 10% coverage and the climatic indices were weighted per </w:t>
-      </w:r>
-      <w:r>
-        <w:t xml:space="preserve">each species </w:t>
-      </w:r>
-      <w:r>
-        <w:t xml:space="preserve">coverage. </w:t>
-      </w:r>
-      <w:r>
-        <w:t>To identify main gradients of species climatic preferences we conducted a principal component analysis (PCA) with the full set of bioclimatic indices</w:t>
-      </w:r>
-      <w:r>
-        <w:t xml:space="preserve"> (fig xx)</w:t>
-      </w:r>
-      <w:r>
-        <w:t>.</w:t>
+        <w:jc w:val="both"/>
+        <w:rPr>
+          <w:lang w:val="es-ES"/>
+        </w:rPr>
+      </w:pPr>
+      <w:r>
+        <w:rPr>
+          <w:lang w:val="es-ES"/>
+        </w:rPr>
+        <w:drawing>
+          <wp:inline distT="0" distB="0" distL="0" distR="0" wp14:anchorId="2BDBCF84" wp14:editId="5C504054">
+            <wp:extent cx="5400040" cy="2700020"/>
+            <wp:effectExtent l="0" t="0" r="0" b="5080"/>
+            <wp:docPr id="1312673568" name="Imagen 1" descr="Gráfico, Gráfico de dispersión&#10;&#10;Descripción generada automáticamente"/>
+            <wp:cNvGraphicFramePr>
+              <a:graphicFrameLocks xmlns:a="http://schemas.openxmlformats.org/drawingml/2006/main" noChangeAspect="1"/>
+            </wp:cNvGraphicFramePr>
+            <a:graphic xmlns:a="http://schemas.openxmlformats.org/drawingml/2006/main">
+              <a:graphicData uri="http://schemas.openxmlformats.org/drawingml/2006/picture">
+                <pic:pic xmlns:pic="http://schemas.openxmlformats.org/drawingml/2006/picture">
+                  <pic:nvPicPr>
+                    <pic:cNvPr id="1312673568" name="Imagen 1" descr="Gráfico, Gráfico de dispersión&#10;&#10;Descripción generada automáticamente"/>
+                    <pic:cNvPicPr>
+                      <a:picLocks noChangeAspect="1" noChangeArrowheads="1"/>
+                    </pic:cNvPicPr>
+                  </pic:nvPicPr>
+                  <pic:blipFill>
+                    <a:blip r:embed="rId15">
+                      <a:extLst>
+                        <a:ext uri="{28A0092B-C50C-407E-A947-70E740481C1C}">
+                          <a14:useLocalDpi xmlns:a14="http://schemas.microsoft.com/office/drawing/2010/main" val="0"/>
+                        </a:ext>
+                      </a:extLst>
+                    </a:blip>
+                    <a:srcRect/>
+                    <a:stretch>
+                      <a:fillRect/>
+                    </a:stretch>
+                  </pic:blipFill>
+                  <pic:spPr bwMode="auto">
+                    <a:xfrm>
+                      <a:off x="0" y="0"/>
+                      <a:ext cx="5400040" cy="2700020"/>
+                    </a:xfrm>
+                    <a:prstGeom prst="rect">
+                      <a:avLst/>
+                    </a:prstGeom>
+                    <a:noFill/>
+                    <a:ln>
+                      <a:noFill/>
+                    </a:ln>
+                  </pic:spPr>
+                </pic:pic>
+              </a:graphicData>
+            </a:graphic>
+          </wp:inline>
+        </w:drawing>
       </w:r>
     </w:p>
     <w:p>
       <w:pPr>
+        <w:spacing w:line="360" w:lineRule="auto"/>
+        <w:jc w:val="both"/>
+      </w:pPr>
+    </w:p>
+    <w:p>
+      <w:pPr>
         <w:pStyle w:val="Ttulo2"/>
         <w:spacing w:line="360" w:lineRule="auto"/>
         <w:rPr>
@@ -2028,7 +3800,6 @@
       <w:pPr>
         <w:shd w:val="clear" w:color="auto" w:fill="FFFFFF"/>
         <w:spacing w:line="360" w:lineRule="auto"/>
-        <w:ind w:firstLine="709"/>
         <w:jc w:val="both"/>
         <w:textAlignment w:val="baseline"/>
         <w:rPr>
@@ -2083,23 +3854,7 @@
           <w:color w:val="000000"/>
           <w:lang w:eastAsia="ca-ES"/>
         </w:rPr>
-        <w:t>)</w:t>
-      </w:r>
-      <w:r>
-        <w:rPr>
-          <w:rFonts w:eastAsia="Times New Roman" w:cstheme="minorHAnsi"/>
-          <w:color w:val="000000"/>
-          <w:lang w:eastAsia="ca-ES"/>
-        </w:rPr>
-        <w:t xml:space="preserve"> and considered </w:t>
-      </w:r>
-      <w:r>
-        <w:rPr>
-          <w:rFonts w:eastAsia="Times New Roman" w:cstheme="minorHAnsi"/>
-          <w:color w:val="000000"/>
-          <w:lang w:eastAsia="ca-ES"/>
-        </w:rPr>
-        <w:t>the species recorded as</w:t>
+        <w:t>) and considered the species recorded as</w:t>
       </w:r>
       <w:r>
         <w:rPr>
@@ -2650,14 +4405,13 @@
           <w:rFonts w:eastAsia="Times New Roman"/>
           <w:lang w:eastAsia="ca-ES"/>
         </w:rPr>
-        <w:t xml:space="preserve">s treatments </w:t>
+        <w:t xml:space="preserve"> treatments </w:t>
       </w:r>
     </w:p>
     <w:p>
       <w:pPr>
         <w:shd w:val="clear" w:color="auto" w:fill="FFFFFF"/>
         <w:spacing w:line="360" w:lineRule="auto"/>
-        <w:ind w:firstLine="709"/>
         <w:jc w:val="both"/>
         <w:textAlignment w:val="baseline"/>
         <w:rPr>
@@ -2736,7 +4490,23 @@
           <w:color w:val="000000"/>
           <w:lang w:eastAsia="ca-ES"/>
         </w:rPr>
-        <w:t xml:space="preserve"> for a total of 4 treatments</w:t>
+        <w:t xml:space="preserve"> </w:t>
+      </w:r>
+      <w:r>
+        <w:rPr>
+          <w:rFonts w:eastAsia="Times New Roman" w:cstheme="minorHAnsi"/>
+          <w:color w:val="000000"/>
+          <w:lang w:eastAsia="ca-ES"/>
+        </w:rPr>
+        <w:t xml:space="preserve">stress </w:t>
+      </w:r>
+      <w:r>
+        <w:rPr>
+          <w:rFonts w:eastAsia="Times New Roman" w:cstheme="minorHAnsi"/>
+          <w:color w:val="000000"/>
+          <w:lang w:eastAsia="ca-ES"/>
+        </w:rPr>
+        <w:t>for a total of 4 treatments</w:t>
       </w:r>
       <w:r>
         <w:rPr>
@@ -2794,6 +4564,7 @@
         </w:rPr>
         <w:t>(referred to as “</w:t>
       </w:r>
+      <w:proofErr w:type="spellStart"/>
       <w:r>
         <w:rPr>
           <w:rFonts w:eastAsia="Times New Roman" w:cstheme="minorHAnsi"/>
@@ -2802,6 +4573,7 @@
         </w:rPr>
         <w:t>alternate_light</w:t>
       </w:r>
+      <w:proofErr w:type="spellEnd"/>
       <w:r>
         <w:rPr>
           <w:rFonts w:eastAsia="Times New Roman" w:cstheme="minorHAnsi"/>
@@ -2856,8 +4628,18 @@
           <w:color w:val="000000"/>
           <w:lang w:eastAsia="ca-ES"/>
         </w:rPr>
-        <w:t>(referred to as “constant_light</w:t>
-      </w:r>
+        <w:t>(referred to as “</w:t>
+      </w:r>
+      <w:proofErr w:type="spellStart"/>
+      <w:r>
+        <w:rPr>
+          <w:rFonts w:eastAsia="Times New Roman" w:cstheme="minorHAnsi"/>
+          <w:color w:val="000000"/>
+          <w:lang w:eastAsia="ca-ES"/>
+        </w:rPr>
+        <w:t>constant_light</w:t>
+      </w:r>
+      <w:proofErr w:type="spellEnd"/>
       <w:r>
         <w:rPr>
           <w:rFonts w:eastAsia="Times New Roman" w:cstheme="minorHAnsi"/>
@@ -2920,15 +4702,51 @@
           <w:color w:val="000000"/>
           <w:lang w:eastAsia="ca-ES"/>
         </w:rPr>
-        <w:t xml:space="preserve"> (referred to as “alternate_WP”) and (3) alternating temperature</w:t>
-      </w:r>
-      <w:r>
-        <w:rPr>
-          <w:rFonts w:eastAsia="Times New Roman" w:cstheme="minorHAnsi"/>
-          <w:color w:val="000000"/>
-          <w:lang w:eastAsia="ca-ES"/>
-        </w:rPr>
-        <w:t>s and constant darkness (referred to as “alternate_dark”).</w:t>
+        <w:t xml:space="preserve"> (referred to as “</w:t>
+      </w:r>
+      <w:proofErr w:type="spellStart"/>
+      <w:r>
+        <w:rPr>
+          <w:rFonts w:eastAsia="Times New Roman" w:cstheme="minorHAnsi"/>
+          <w:color w:val="000000"/>
+          <w:lang w:eastAsia="ca-ES"/>
+        </w:rPr>
+        <w:t>alternate_WP</w:t>
+      </w:r>
+      <w:proofErr w:type="spellEnd"/>
+      <w:r>
+        <w:rPr>
+          <w:rFonts w:eastAsia="Times New Roman" w:cstheme="minorHAnsi"/>
+          <w:color w:val="000000"/>
+          <w:lang w:eastAsia="ca-ES"/>
+        </w:rPr>
+        <w:t>”) and (3) alternating temperature</w:t>
+      </w:r>
+      <w:r>
+        <w:rPr>
+          <w:rFonts w:eastAsia="Times New Roman" w:cstheme="minorHAnsi"/>
+          <w:color w:val="000000"/>
+          <w:lang w:eastAsia="ca-ES"/>
+        </w:rPr>
+        <w:t>s and constant darkness (referred to as “</w:t>
+      </w:r>
+      <w:proofErr w:type="spellStart"/>
+      <w:r>
+        <w:rPr>
+          <w:rFonts w:eastAsia="Times New Roman" w:cstheme="minorHAnsi"/>
+          <w:color w:val="000000"/>
+          <w:lang w:eastAsia="ca-ES"/>
+        </w:rPr>
+        <w:t>alternate_dark</w:t>
+      </w:r>
+      <w:proofErr w:type="spellEnd"/>
+      <w:r>
+        <w:rPr>
+          <w:rFonts w:eastAsia="Times New Roman" w:cstheme="minorHAnsi"/>
+          <w:color w:val="000000"/>
+          <w:lang w:eastAsia="ca-ES"/>
+        </w:rPr>
+        <w:t>”).</w:t>
       </w:r>
       <w:r>
         <w:rPr>
@@ -3320,15 +5138,15 @@
           <w:color w:val="000000"/>
           <w:lang w:eastAsia="ca-ES"/>
         </w:rPr>
-        <w:t>p</w:t>
-      </w:r>
-      <w:r>
-        <w:rPr>
-          <w:rFonts w:eastAsia="Times New Roman" w:cstheme="minorHAnsi"/>
-          <w:color w:val="000000"/>
-          <w:lang w:eastAsia="ca-ES"/>
-        </w:rPr>
-        <w:t xml:space="preserve">etri dishes </w:t>
+        <w:t>Petri</w:t>
+      </w:r>
+      <w:r>
+        <w:rPr>
+          <w:rFonts w:eastAsia="Times New Roman" w:cstheme="minorHAnsi"/>
+          <w:color w:val="000000"/>
+          <w:lang w:eastAsia="ca-ES"/>
+        </w:rPr>
+        <w:t xml:space="preserve"> dishes </w:t>
       </w:r>
       <w:r>
         <w:rPr>
@@ -3655,21 +5473,13 @@
           <w:rFonts w:eastAsia="Times New Roman"/>
           <w:lang w:eastAsia="ca-ES"/>
         </w:rPr>
-        <w:t>trials</w:t>
-      </w:r>
-      <w:r>
-        <w:rPr>
-          <w:rFonts w:eastAsia="Times New Roman"/>
-          <w:lang w:eastAsia="ca-ES"/>
-        </w:rPr>
-        <w:t xml:space="preserve"> </w:t>
+        <w:t xml:space="preserve">trials </w:t>
       </w:r>
     </w:p>
     <w:p>
       <w:pPr>
         <w:shd w:val="clear" w:color="auto" w:fill="FFFFFF"/>
         <w:spacing w:line="360" w:lineRule="auto"/>
-        <w:ind w:firstLine="709"/>
         <w:jc w:val="both"/>
         <w:textAlignment w:val="baseline"/>
         <w:rPr>
@@ -3713,13 +5523,23 @@
       <w:r>
         <w:t>90 mm Ø Petri dishes with two layers of filter paper (</w:t>
       </w:r>
-      <w:r>
-        <w:rPr>
-          <w:rFonts w:eastAsia="Times New Roman" w:cstheme="minorHAnsi"/>
-          <w:color w:val="000000"/>
-          <w:lang w:eastAsia="ca-ES"/>
-        </w:rPr>
-        <w:t>Filtros Anoia S.A. paper for germination assays, Ref.518G085</w:t>
+      <w:proofErr w:type="spellStart"/>
+      <w:r>
+        <w:rPr>
+          <w:rFonts w:eastAsia="Times New Roman" w:cstheme="minorHAnsi"/>
+          <w:color w:val="000000"/>
+          <w:lang w:eastAsia="ca-ES"/>
+        </w:rPr>
+        <w:t>Filtros</w:t>
+      </w:r>
+      <w:proofErr w:type="spellEnd"/>
+      <w:r>
+        <w:rPr>
+          <w:rFonts w:eastAsia="Times New Roman" w:cstheme="minorHAnsi"/>
+          <w:color w:val="000000"/>
+          <w:lang w:eastAsia="ca-ES"/>
+        </w:rPr>
+        <w:t xml:space="preserve"> Anoia S.A. paper for germination assays, Ref.518G085</w:t>
       </w:r>
       <w:r>
         <w:t>)</w:t>
@@ -3749,7 +5569,15 @@
         <w:t>s</w:t>
       </w:r>
       <w:r>
-        <w:t xml:space="preserve"> for alternate_dark treatment, </w:t>
+        <w:t xml:space="preserve"> for </w:t>
+      </w:r>
+      <w:proofErr w:type="spellStart"/>
+      <w:r>
+        <w:t>alternate_dark</w:t>
+      </w:r>
+      <w:proofErr w:type="spellEnd"/>
+      <w:r>
+        <w:t xml:space="preserve"> treatment, </w:t>
       </w:r>
       <w:r>
         <w:t xml:space="preserve">added 6ml of distilled water, sealed with parafilm </w:t>
@@ -3767,14 +5595,21 @@
         <w:t xml:space="preserve">. </w:t>
       </w:r>
       <w:r>
-        <w:t>Next, we transfer the seeds for the alternate_WP</w:t>
-      </w:r>
+        <w:t xml:space="preserve">Next, we transfer the seeds for the </w:t>
+      </w:r>
+      <w:proofErr w:type="spellStart"/>
+      <w:r>
+        <w:t>alternate_WP</w:t>
+      </w:r>
+      <w:proofErr w:type="spellEnd"/>
       <w:r>
         <w:t xml:space="preserve"> </w:t>
       </w:r>
+      <w:proofErr w:type="spellStart"/>
       <w:r>
         <w:t>treatmeant</w:t>
       </w:r>
+      <w:proofErr w:type="spellEnd"/>
       <w:r>
         <w:t xml:space="preserve">, where instead of distilled water we added 6ml of </w:t>
       </w:r>
@@ -3788,7 +5623,15 @@
         <w:t xml:space="preserve">) </w:t>
       </w:r>
       <w:r>
-        <w:t>to simulate a -0.6 Mpa of water potential</w:t>
+        <w:t xml:space="preserve">to simulate a -0.6 </w:t>
+      </w:r>
+      <w:proofErr w:type="spellStart"/>
+      <w:r>
+        <w:t>Mpa</w:t>
+      </w:r>
+      <w:proofErr w:type="spellEnd"/>
+      <w:r>
+        <w:t xml:space="preserve"> of water potential</w:t>
       </w:r>
       <w:r>
         <w:t xml:space="preserve"> and sealed with parafilm</w:t>
@@ -3878,10 +5721,7 @@
         <w:t xml:space="preserve">and </w:t>
       </w:r>
       <w:r>
-        <w:t>22 - 12</w:t>
-      </w:r>
-      <w:r>
-        <w:t>ºC</w:t>
+        <w:t>22 - 12ºC</w:t>
       </w:r>
       <w:r>
         <w:t xml:space="preserve"> </w:t>
@@ -3898,9 +5738,19 @@
       <w:r>
         <w:t xml:space="preserve">the rest of the seed were divided between </w:t>
       </w:r>
-      <w:r>
-        <w:t>alternate_light (control treatment) and constant_light</w:t>
-      </w:r>
+      <w:proofErr w:type="spellStart"/>
+      <w:r>
+        <w:t>alternate_light</w:t>
+      </w:r>
+      <w:proofErr w:type="spellEnd"/>
+      <w:r>
+        <w:t xml:space="preserve"> (control treatment) and </w:t>
+      </w:r>
+      <w:proofErr w:type="spellStart"/>
+      <w:r>
+        <w:t>constant_light</w:t>
+      </w:r>
+      <w:proofErr w:type="spellEnd"/>
       <w:r>
         <w:t xml:space="preserve"> treatments</w:t>
       </w:r>
@@ -3908,10 +5758,7 @@
         <w:t xml:space="preserve">, </w:t>
       </w:r>
       <w:r>
-        <w:t>added 6ml of distilled water</w:t>
-      </w:r>
-      <w:r>
-        <w:t xml:space="preserve"> and sealed with parafilm</w:t>
+        <w:t>added 6ml of distilled water and sealed with parafilm</w:t>
       </w:r>
       <w:r>
         <w:t xml:space="preserve">. </w:t>
@@ -4033,7 +5880,23 @@
           <w:rFonts w:cstheme="minorHAnsi"/>
           <w:color w:val="000000"/>
         </w:rPr>
-        <w:t xml:space="preserve"> with white and firm embryos viable, i.e. potentially germinable </w:t>
+        <w:t xml:space="preserve"> with white and firm embryos viable, i.e. potentially </w:t>
+      </w:r>
+      <w:proofErr w:type="spellStart"/>
+      <w:r>
+        <w:rPr>
+          <w:rFonts w:cstheme="minorHAnsi"/>
+          <w:color w:val="000000"/>
+        </w:rPr>
+        <w:t>germinable</w:t>
+      </w:r>
+      <w:proofErr w:type="spellEnd"/>
+      <w:r>
+        <w:rPr>
+          <w:rFonts w:cstheme="minorHAnsi"/>
+          <w:color w:val="000000"/>
+        </w:rPr>
+        <w:t xml:space="preserve"> </w:t>
       </w:r>
       <w:r>
         <w:rPr>
@@ -4319,7 +6182,7 @@
         </w:rPr>
         <w:t xml:space="preserve"> </w:t>
       </w:r>
-      <w:commentRangeStart w:id="2"/>
+      <w:commentRangeStart w:id="4"/>
       <w:r>
         <w:rPr>
           <w:rFonts w:eastAsia="Times New Roman"/>
@@ -4328,72 +6191,105 @@
         </w:rPr>
         <w:t>Statistical analysis</w:t>
       </w:r>
-      <w:commentRangeEnd w:id="2"/>
+      <w:commentRangeEnd w:id="4"/>
       <w:r>
         <w:rPr>
           <w:rStyle w:val="Refdecomentario"/>
           <w:rFonts w:ascii="Calibri" w:eastAsia="Calibri" w:hAnsi="Calibri" w:cs="Calibri"/>
           <w:color w:val="auto"/>
         </w:rPr>
-        <w:commentReference w:id="2"/>
+        <w:commentReference w:id="4"/>
       </w:r>
     </w:p>
     <w:p>
       <w:pPr>
-        <w:shd w:val="clear" w:color="auto" w:fill="FFFFFF"/>
-        <w:spacing w:line="360" w:lineRule="auto"/>
-        <w:ind w:firstLine="709"/>
-        <w:jc w:val="both"/>
-        <w:textAlignment w:val="baseline"/>
-        <w:rPr>
-          <w:rFonts w:eastAsia="Times New Roman" w:cstheme="minorHAnsi"/>
-          <w:color w:val="000000"/>
+        <w:pStyle w:val="Ttulo2"/>
+        <w:spacing w:after="160" w:line="360" w:lineRule="auto"/>
+        <w:rPr>
+          <w:rFonts w:asciiTheme="minorHAnsi" w:eastAsia="Times New Roman" w:hAnsiTheme="minorHAnsi" w:cstheme="minorHAnsi"/>
+          <w:color w:val="000000"/>
+          <w:sz w:val="22"/>
+          <w:szCs w:val="22"/>
           <w:highlight w:val="yellow"/>
           <w:lang w:eastAsia="ca-ES"/>
         </w:rPr>
       </w:pPr>
       <w:r>
         <w:rPr>
-          <w:rFonts w:eastAsia="Times New Roman" w:cstheme="minorHAnsi"/>
-          <w:color w:val="000000"/>
+          <w:rFonts w:asciiTheme="minorHAnsi" w:eastAsia="Times New Roman" w:hAnsiTheme="minorHAnsi" w:cstheme="minorHAnsi"/>
+          <w:color w:val="000000"/>
+          <w:sz w:val="22"/>
+          <w:szCs w:val="22"/>
           <w:highlight w:val="yellow"/>
           <w:lang w:eastAsia="ca-ES"/>
         </w:rPr>
-        <w:t>We analyzed the data by fitting Markov Chain Monte Carlo generalized linear mixed models (MCMCglmm) with Bayesian estimation using the R package MCMC</w:t>
-      </w:r>
-      <w:r>
-        <w:rPr>
-          <w:rFonts w:eastAsia="Times New Roman" w:cstheme="minorHAnsi"/>
-          <w:color w:val="000000"/>
-          <w:sz w:val="14"/>
-          <w:szCs w:val="14"/>
+        <w:t xml:space="preserve">We </w:t>
+      </w:r>
+      <w:proofErr w:type="spellStart"/>
+      <w:r>
+        <w:rPr>
+          <w:rFonts w:asciiTheme="minorHAnsi" w:eastAsia="Times New Roman" w:hAnsiTheme="minorHAnsi" w:cstheme="minorHAnsi"/>
+          <w:color w:val="000000"/>
+          <w:sz w:val="22"/>
+          <w:szCs w:val="22"/>
           <w:highlight w:val="yellow"/>
           <w:lang w:eastAsia="ca-ES"/>
         </w:rPr>
-        <w:t>GLMM</w:t>
-      </w:r>
-      <w:r>
-        <w:rPr>
-          <w:rFonts w:eastAsia="Times New Roman" w:cstheme="minorHAnsi"/>
-          <w:color w:val="000000"/>
+        <w:t>analyzed</w:t>
+      </w:r>
+      <w:proofErr w:type="spellEnd"/>
+      <w:r>
+        <w:rPr>
+          <w:rFonts w:asciiTheme="minorHAnsi" w:eastAsia="Times New Roman" w:hAnsiTheme="minorHAnsi" w:cstheme="minorHAnsi"/>
+          <w:color w:val="000000"/>
+          <w:sz w:val="22"/>
+          <w:szCs w:val="22"/>
           <w:highlight w:val="yellow"/>
           <w:lang w:eastAsia="ca-ES"/>
         </w:rPr>
-        <w:t xml:space="preserve"> </w:t>
-      </w:r>
-      <w:r>
-        <w:rPr>
-          <w:rFonts w:eastAsia="Times New Roman" w:cstheme="minorHAnsi"/>
-          <w:color w:val="000000"/>
+        <w:t xml:space="preserve"> the data by fitting Markov Chain Monte Carlo generalized linear mixed models (</w:t>
+      </w:r>
+      <w:proofErr w:type="spellStart"/>
+      <w:r>
+        <w:rPr>
+          <w:rFonts w:asciiTheme="minorHAnsi" w:eastAsia="Times New Roman" w:hAnsiTheme="minorHAnsi" w:cstheme="minorHAnsi"/>
+          <w:color w:val="000000"/>
+          <w:sz w:val="22"/>
+          <w:szCs w:val="22"/>
           <w:highlight w:val="yellow"/>
           <w:lang w:eastAsia="ca-ES"/>
         </w:rPr>
+        <w:t>MCMCglmm</w:t>
+      </w:r>
+      <w:proofErr w:type="spellEnd"/>
+      <w:r>
+        <w:rPr>
+          <w:rFonts w:asciiTheme="minorHAnsi" w:eastAsia="Times New Roman" w:hAnsiTheme="minorHAnsi" w:cstheme="minorHAnsi"/>
+          <w:color w:val="000000"/>
+          <w:sz w:val="22"/>
+          <w:szCs w:val="22"/>
+          <w:highlight w:val="yellow"/>
+          <w:lang w:eastAsia="ca-ES"/>
+        </w:rPr>
+        <w:t xml:space="preserve">) with Bayesian estimation using the R package MCMCGLMM </w:t>
+      </w:r>
+      <w:r>
+        <w:rPr>
+          <w:rFonts w:asciiTheme="minorHAnsi" w:eastAsia="Times New Roman" w:hAnsiTheme="minorHAnsi" w:cstheme="minorHAnsi"/>
+          <w:color w:val="000000"/>
+          <w:sz w:val="22"/>
+          <w:szCs w:val="22"/>
+          <w:highlight w:val="yellow"/>
+          <w:lang w:eastAsia="ca-ES"/>
+        </w:rPr>
         <w:fldChar w:fldCharType="begin" w:fldLock="1"/>
       </w:r>
       <w:r>
         <w:rPr>
-          <w:rFonts w:eastAsia="Times New Roman" w:cstheme="minorHAnsi"/>
-          <w:color w:val="000000"/>
+          <w:rFonts w:asciiTheme="minorHAnsi" w:eastAsia="Times New Roman" w:hAnsiTheme="minorHAnsi" w:cstheme="minorHAnsi"/>
+          <w:color w:val="000000"/>
+          <w:sz w:val="22"/>
+          <w:szCs w:val="22"/>
           <w:highlight w:val="yellow"/>
           <w:lang w:eastAsia="ca-ES"/>
         </w:rPr>
@@ -4401,8 +6297,10 @@
       </w:r>
       <w:r>
         <w:rPr>
-          <w:rFonts w:eastAsia="Times New Roman" w:cstheme="minorHAnsi"/>
-          <w:color w:val="000000"/>
+          <w:rFonts w:asciiTheme="minorHAnsi" w:eastAsia="Times New Roman" w:hAnsiTheme="minorHAnsi" w:cstheme="minorHAnsi"/>
+          <w:color w:val="000000"/>
+          <w:sz w:val="22"/>
+          <w:szCs w:val="22"/>
           <w:highlight w:val="yellow"/>
           <w:lang w:eastAsia="ca-ES"/>
         </w:rPr>
@@ -4410,9 +6308,10 @@
       </w:r>
       <w:r>
         <w:rPr>
-          <w:rFonts w:eastAsia="Times New Roman" w:cstheme="minorHAnsi"/>
-          <w:noProof/>
-          <w:color w:val="000000"/>
+          <w:rFonts w:asciiTheme="minorHAnsi" w:eastAsia="Times New Roman" w:hAnsiTheme="minorHAnsi" w:cstheme="minorHAnsi"/>
+          <w:color w:val="000000"/>
+          <w:sz w:val="22"/>
+          <w:szCs w:val="22"/>
           <w:highlight w:val="yellow"/>
           <w:lang w:eastAsia="ca-ES"/>
         </w:rPr>
@@ -4420,8 +6319,10 @@
       </w:r>
       <w:r>
         <w:rPr>
-          <w:rFonts w:eastAsia="Times New Roman" w:cstheme="minorHAnsi"/>
-          <w:color w:val="000000"/>
+          <w:rFonts w:asciiTheme="minorHAnsi" w:eastAsia="Times New Roman" w:hAnsiTheme="minorHAnsi" w:cstheme="minorHAnsi"/>
+          <w:color w:val="000000"/>
+          <w:sz w:val="22"/>
+          <w:szCs w:val="22"/>
           <w:highlight w:val="yellow"/>
           <w:lang w:eastAsia="ca-ES"/>
         </w:rPr>
@@ -4429,360 +6330,76 @@
       </w:r>
       <w:r>
         <w:rPr>
-          <w:rFonts w:eastAsia="Times New Roman" w:cstheme="minorHAnsi"/>
-          <w:color w:val="000000"/>
+          <w:rFonts w:asciiTheme="minorHAnsi" w:eastAsia="Times New Roman" w:hAnsiTheme="minorHAnsi" w:cstheme="minorHAnsi"/>
+          <w:color w:val="000000"/>
+          <w:sz w:val="22"/>
+          <w:szCs w:val="22"/>
           <w:highlight w:val="yellow"/>
           <w:lang w:eastAsia="ca-ES"/>
         </w:rPr>
-        <w:t xml:space="preserve">. To model germination traits, we used binomial MCMCglmms (family = multinomial2) while for the t50 and EHS traits we scaled the values and used gaussian MCMCglmms (family = gaussian). </w:t>
+        <w:t xml:space="preserve">. To model germination traits, we used binomial </w:t>
+      </w:r>
+      <w:proofErr w:type="spellStart"/>
+      <w:r>
+        <w:rPr>
+          <w:rFonts w:asciiTheme="minorHAnsi" w:eastAsia="Times New Roman" w:hAnsiTheme="minorHAnsi" w:cstheme="minorHAnsi"/>
+          <w:color w:val="000000"/>
+          <w:sz w:val="22"/>
+          <w:szCs w:val="22"/>
+          <w:highlight w:val="yellow"/>
+          <w:lang w:eastAsia="ca-ES"/>
+        </w:rPr>
+        <w:t>MCMCglmms</w:t>
+      </w:r>
+      <w:proofErr w:type="spellEnd"/>
+      <w:r>
+        <w:rPr>
+          <w:rFonts w:asciiTheme="minorHAnsi" w:eastAsia="Times New Roman" w:hAnsiTheme="minorHAnsi" w:cstheme="minorHAnsi"/>
+          <w:color w:val="000000"/>
+          <w:sz w:val="22"/>
+          <w:szCs w:val="22"/>
+          <w:highlight w:val="yellow"/>
+          <w:lang w:eastAsia="ca-ES"/>
+        </w:rPr>
+        <w:t xml:space="preserve"> (family = multinomial2 </w:t>
       </w:r>
     </w:p>
     <w:p>
       <w:pPr>
-        <w:shd w:val="clear" w:color="auto" w:fill="FFFFFF"/>
         <w:spacing w:line="360" w:lineRule="auto"/>
-        <w:ind w:firstLine="709"/>
-        <w:jc w:val="both"/>
-        <w:textAlignment w:val="baseline"/>
-        <w:rPr>
-          <w:rFonts w:eastAsia="Times New Roman" w:cstheme="minorHAnsi"/>
-          <w:color w:val="000000"/>
-          <w:highlight w:val="yellow"/>
-          <w:lang w:eastAsia="ca-ES"/>
-        </w:rPr>
-      </w:pPr>
-      <w:r>
-        <w:rPr>
-          <w:rFonts w:eastAsia="Times New Roman" w:cstheme="minorHAnsi"/>
-          <w:color w:val="000000"/>
-          <w:highlight w:val="yellow"/>
-          <w:lang w:eastAsia="ca-ES"/>
-        </w:rPr>
-        <w:lastRenderedPageBreak/>
-        <w:t xml:space="preserve">To answer the first question, we analyzed each system separately and modelled, with MCMCglmm, every germination trait as response variable and incubator as explanatory variable (fixed factor), while phylogeny and sampling site (nested within species) were specified as random factors (germination trait~ incubator). To answer the second question, we tested each germination trait as response variable with both incubator and system as explanatory variables (fixed factors) paying special attention to their interaction. Random factors remained the same as the first model (germination trait ~ incubator * system). Phylogeny was included using a reconstructed tree for the 54 species, created with V.PHYLOMAKER R package </w:t>
-      </w:r>
-      <w:r>
-        <w:rPr>
-          <w:rFonts w:eastAsia="Times New Roman" w:cstheme="minorHAnsi"/>
-          <w:color w:val="000000"/>
-          <w:highlight w:val="yellow"/>
-          <w:lang w:eastAsia="ca-ES"/>
-        </w:rPr>
-        <w:fldChar w:fldCharType="begin" w:fldLock="1"/>
-      </w:r>
-      <w:r>
-        <w:rPr>
-          <w:rFonts w:eastAsia="Times New Roman" w:cstheme="minorHAnsi"/>
-          <w:color w:val="000000"/>
-          <w:highlight w:val="yellow"/>
-          <w:lang w:eastAsia="ca-ES"/>
-        </w:rPr>
-        <w:instrText>ADDIN CSL_CITATION {"citationItems":[{"id":"ITEM-1","itemData":{"DOI":"10.1111/ecog.04434","ISBN":"0000000213","ISSN":"16000587","abstract":"We present V.PhyloMaker, a freely available package for R designed to generate phylogenies for vascular plants. The mega-tree implemented in V.PhyloMaker (i.e. GBOTB.extended.tre), which was derived from two recently published mega-trees and includes 74 533 species and all families of extant vascular plants, is the largest dated phylogeny for vascular plants. V.PhyloMaker can generate phylogenies for very large species lists (the largest species list that we tested included 314 686 species). V.PhyloMaker generates phylogenies at a fast speed, much faster than other phylogeny-generating packages. Our tests of V.PhyloMaker show that generating a phylogeny for 60 000 species requires less than six hours. V.PhyloMaker includes an approach to attach genera or species to their close relatives in a phylogeny. We provide a simple example in this paper to show how to use V.PhyloMaker to generate phylogenies.","author":[{"dropping-particle":"","family":"Jin","given":"Yi","non-dropping-particle":"","parse-names":false,"suffix":""},{"dropping-particle":"","family":"Qian","given":"Hong","non-dropping-particle":"","parse-names":false,"suffix":""}],"container-title":"Ecography","id":"ITEM-1","issue":"8","issued":{"date-parts":[["2019"]]},"page":"1353-1359","title":"V.PhyloMaker: an R package that can generate very large phylogenies for vascular plants","type":"article-journal","volume":"42"},"uris":["http://www.mendeley.com/documents/?uuid=b2d3562c-8a69-42da-a044-0885d559ed82"]}],"mendeley":{"formattedCitation":"(Jin and Qian, 2019)","plainTextFormattedCitation":"(Jin and Qian, 2019)","previouslyFormattedCitation":"(Jin and Qian, 2019)"},"properties":{"noteIndex":0},"schema":"https://github.com/citation-style-language/schema/raw/master/csl-citation.json"}</w:instrText>
-      </w:r>
-      <w:r>
-        <w:rPr>
-          <w:rFonts w:eastAsia="Times New Roman" w:cstheme="minorHAnsi"/>
-          <w:color w:val="000000"/>
-          <w:highlight w:val="yellow"/>
-          <w:lang w:eastAsia="ca-ES"/>
-        </w:rPr>
-        <w:fldChar w:fldCharType="separate"/>
-      </w:r>
-      <w:r>
-        <w:rPr>
-          <w:rFonts w:eastAsia="Times New Roman" w:cstheme="minorHAnsi"/>
-          <w:noProof/>
-          <w:color w:val="000000"/>
-          <w:highlight w:val="yellow"/>
-          <w:lang w:eastAsia="ca-ES"/>
-        </w:rPr>
-        <w:t>(Jin and Qian, 2019)</w:t>
-      </w:r>
-      <w:r>
-        <w:rPr>
-          <w:rFonts w:eastAsia="Times New Roman" w:cstheme="minorHAnsi"/>
-          <w:color w:val="000000"/>
-          <w:highlight w:val="yellow"/>
-          <w:lang w:eastAsia="ca-ES"/>
-        </w:rPr>
-        <w:fldChar w:fldCharType="end"/>
-      </w:r>
-      <w:r>
-        <w:rPr>
-          <w:rFonts w:eastAsia="Times New Roman" w:cstheme="minorHAnsi"/>
-          <w:color w:val="000000"/>
-          <w:highlight w:val="yellow"/>
-          <w:lang w:eastAsia="ca-ES"/>
-        </w:rPr>
-        <w:t xml:space="preserve"> and represented using phylosignal and phylobase R packages </w:t>
-      </w:r>
-      <w:r>
-        <w:rPr>
-          <w:rFonts w:eastAsia="Times New Roman" w:cstheme="minorHAnsi"/>
-          <w:color w:val="000000"/>
-          <w:highlight w:val="yellow"/>
-          <w:lang w:eastAsia="ca-ES"/>
-        </w:rPr>
-        <w:fldChar w:fldCharType="begin" w:fldLock="1"/>
-      </w:r>
-      <w:r>
-        <w:rPr>
-          <w:rFonts w:eastAsia="Times New Roman" w:cstheme="minorHAnsi"/>
-          <w:color w:val="000000"/>
-          <w:highlight w:val="yellow"/>
-          <w:lang w:eastAsia="ca-ES"/>
-        </w:rPr>
-        <w:instrText>ADDIN CSL_CITATION {"citationItems":[{"id":"ITEM-1","itemData":{"DOI":"10.1002/ece3.2051","author":[{"dropping-particle":"","family":"Keck","given":"Francois","non-dropping-particle":"","parse-names":false,"suffix":""},{"dropping-particle":"","family":"Rimet","given":"Frederic","non-dropping-particle":"","parse-names":false,"suffix":""},{"dropping-particle":"","family":"Bouchez","given":"Agnes","non-dropping-particle":"","parse-names":false,"suffix":""},{"dropping-particle":"","family":"Franc","given":"Alain","non-dropping-particle":"","parse-names":false,"suffix":""}],"container-title":"Ecology and Evolution","id":"ITEM-1","issue":"9","issued":{"date-parts":[["2016"]]},"page":"2774-2780","title":"phylosignal: an R package to measure, test, and explore the phylogenetic signal","type":"article-journal","volume":"6"},"uris":["http://www.mendeley.com/documents/?uuid=9a43c0ff-47d9-476a-9a49-11dbad0d6d48"]},{"id":"ITEM-2","itemData":{"author":[{"dropping-particle":"","family":"R Hackathon et al.","given":"","non-dropping-particle":"","parse-names":false,"suffix":""}],"id":"ITEM-2","issued":{"date-parts":[["2020"]]},"number":"R package version 0.8.10","title":"phylobase: Base Package for Phylogenetic Structures and Comparative Data","type":"article"},"uris":["http://www.mendeley.com/documents/?uuid=aee7bdc8-bcfd-4ca8-841f-02357bcd296c"]}],"mendeley":{"formattedCitation":"(Keck &lt;i&gt;et al.&lt;/i&gt;, 2016; R Hackathon et al., 2020)","plainTextFormattedCitation":"(Keck et al., 2016; R Hackathon et al., 2020)","previouslyFormattedCitation":"(Keck &lt;i&gt;et al.&lt;/i&gt;, 2016; R Hackathon et al., 2020)"},"properties":{"noteIndex":0},"schema":"https://github.com/citation-style-language/schema/raw/master/csl-citation.json"}</w:instrText>
-      </w:r>
-      <w:r>
-        <w:rPr>
-          <w:rFonts w:eastAsia="Times New Roman" w:cstheme="minorHAnsi"/>
-          <w:color w:val="000000"/>
-          <w:highlight w:val="yellow"/>
-          <w:lang w:eastAsia="ca-ES"/>
-        </w:rPr>
-        <w:fldChar w:fldCharType="separate"/>
-      </w:r>
-      <w:r>
-        <w:rPr>
-          <w:rFonts w:eastAsia="Times New Roman" w:cstheme="minorHAnsi"/>
-          <w:noProof/>
-          <w:color w:val="000000"/>
-          <w:highlight w:val="yellow"/>
-          <w:lang w:eastAsia="ca-ES"/>
-        </w:rPr>
-        <w:t xml:space="preserve">(Keck </w:t>
-      </w:r>
-      <w:r>
-        <w:rPr>
-          <w:rFonts w:eastAsia="Times New Roman" w:cstheme="minorHAnsi"/>
-          <w:i/>
-          <w:noProof/>
-          <w:color w:val="000000"/>
-          <w:highlight w:val="yellow"/>
-          <w:lang w:eastAsia="ca-ES"/>
-        </w:rPr>
-        <w:t>et al.</w:t>
-      </w:r>
-      <w:r>
-        <w:rPr>
-          <w:rFonts w:eastAsia="Times New Roman" w:cstheme="minorHAnsi"/>
-          <w:noProof/>
-          <w:color w:val="000000"/>
-          <w:highlight w:val="yellow"/>
-          <w:lang w:eastAsia="ca-ES"/>
-        </w:rPr>
-        <w:t>, 2016; R Hackathon et al., 2020)</w:t>
-      </w:r>
-      <w:r>
-        <w:rPr>
-          <w:rFonts w:eastAsia="Times New Roman" w:cstheme="minorHAnsi"/>
-          <w:color w:val="000000"/>
-          <w:highlight w:val="yellow"/>
-          <w:lang w:eastAsia="ca-ES"/>
-        </w:rPr>
-        <w:fldChar w:fldCharType="end"/>
-      </w:r>
-      <w:r>
-        <w:rPr>
-          <w:rFonts w:eastAsia="Times New Roman" w:cstheme="minorHAnsi"/>
-          <w:color w:val="000000"/>
-          <w:highlight w:val="yellow"/>
-          <w:lang w:eastAsia="ca-ES"/>
-        </w:rPr>
-        <w:t xml:space="preserve">. In all models we used weakly informative priors, with parameter-expanded priors for the random effects. Each model was run for 1 000 000 iterations, with an initial burn of 100 000 and a thinning interval of 100. From the resulting posterior distributions, we calculated mean parameter estimates and 95% credible intervals (CI). To estimate phylogenetic signal of seed germination over all variables we used Pagels’s lambda (λ) </w:t>
-      </w:r>
-      <w:r>
-        <w:rPr>
-          <w:rFonts w:eastAsia="Times New Roman" w:cstheme="minorHAnsi"/>
-          <w:color w:val="000000"/>
-          <w:highlight w:val="yellow"/>
-          <w:lang w:eastAsia="ca-ES"/>
-        </w:rPr>
-        <w:fldChar w:fldCharType="begin" w:fldLock="1"/>
-      </w:r>
-      <w:r>
-        <w:rPr>
-          <w:rFonts w:eastAsia="Times New Roman" w:cstheme="minorHAnsi"/>
-          <w:color w:val="000000"/>
-          <w:highlight w:val="yellow"/>
-          <w:lang w:eastAsia="ca-ES"/>
-        </w:rPr>
-        <w:instrText>ADDIN CSL_CITATION {"citationItems":[{"id":"ITEM-1","itemData":{"abstract":"Phylogenetic trees describe the pattern of descent amongst a group of species. With the rapid accumulation of DNA sequence data, more and more phylogenies are being constructed based upon sequence comparisons. The combination of these phylogenies with powerful new statistical approaches for the analysis of biological evolution is challenging widely held beliefs about the history and evolution of life on Earth.","author":[{"dropping-particle":"","family":"M. Pagel","given":"","non-dropping-particle":"","parse-names":false,"suffix":""}],"container-title":"Nature","id":"ITEM-1","issue":"October","issued":{"date-parts":[["1999"]]},"page":"877-884","title":"Inferring the historical patterns of biological evolution","type":"article-journal","volume":"401"},"uris":["http://www.mendeley.com/documents/?uuid=475e9593-006f-4538-964f-34268e455624"]}],"mendeley":{"formattedCitation":"(M. Pagel, 1999)","manualFormatting":"(Pagel, 1999)","plainTextFormattedCitation":"(M. Pagel, 1999)","previouslyFormattedCitation":"(M. Pagel, 1999)"},"properties":{"noteIndex":0},"schema":"https://github.com/citation-style-language/schema/raw/master/csl-citation.json"}</w:instrText>
-      </w:r>
-      <w:r>
-        <w:rPr>
-          <w:rFonts w:eastAsia="Times New Roman" w:cstheme="minorHAnsi"/>
-          <w:color w:val="000000"/>
-          <w:highlight w:val="yellow"/>
-          <w:lang w:eastAsia="ca-ES"/>
-        </w:rPr>
-        <w:fldChar w:fldCharType="separate"/>
-      </w:r>
-      <w:r>
-        <w:rPr>
-          <w:rFonts w:eastAsia="Times New Roman" w:cstheme="minorHAnsi"/>
-          <w:noProof/>
-          <w:color w:val="000000"/>
-          <w:highlight w:val="yellow"/>
-          <w:lang w:eastAsia="ca-ES"/>
-        </w:rPr>
-        <w:t>(Pagel, 1999)</w:t>
-      </w:r>
-      <w:r>
-        <w:rPr>
-          <w:rFonts w:eastAsia="Times New Roman" w:cstheme="minorHAnsi"/>
-          <w:color w:val="000000"/>
-          <w:highlight w:val="yellow"/>
-          <w:lang w:eastAsia="ca-ES"/>
-        </w:rPr>
-        <w:fldChar w:fldCharType="end"/>
-      </w:r>
-      <w:r>
-        <w:rPr>
-          <w:rFonts w:eastAsia="Times New Roman" w:cstheme="minorHAnsi"/>
-          <w:color w:val="000000"/>
-          <w:highlight w:val="yellow"/>
-          <w:lang w:eastAsia="ca-ES"/>
-        </w:rPr>
-        <w:t xml:space="preserve">.  </w:t>
-      </w:r>
+        <w:rPr>
+          <w:rFonts w:eastAsia="Times New Roman" w:cstheme="minorHAnsi"/>
+          <w:color w:val="000000"/>
+          <w:lang w:eastAsia="ca-ES"/>
+        </w:rPr>
+      </w:pPr>
     </w:p>
     <w:p>
       <w:pPr>
-        <w:shd w:val="clear" w:color="auto" w:fill="FFFFFF"/>
         <w:spacing w:line="360" w:lineRule="auto"/>
-        <w:ind w:firstLine="709"/>
-        <w:jc w:val="both"/>
-        <w:textAlignment w:val="baseline"/>
-        <w:rPr>
-          <w:rFonts w:eastAsia="Times New Roman" w:cstheme="minorHAnsi"/>
-          <w:color w:val="000000"/>
-          <w:lang w:eastAsia="ca-ES"/>
-        </w:rPr>
-      </w:pPr>
-      <w:r>
-        <w:rPr>
-          <w:rFonts w:eastAsia="Times New Roman" w:cstheme="minorHAnsi"/>
-          <w:color w:val="000000"/>
-          <w:highlight w:val="yellow"/>
-          <w:lang w:eastAsia="ca-ES"/>
-        </w:rPr>
-        <w:t xml:space="preserve">To further explore the relationship between species and germination traits we divided the raw data in 2 subsets, one per each incubator and perform a PCA  with FactoMineR package </w:t>
-      </w:r>
-      <w:r>
-        <w:rPr>
-          <w:rFonts w:eastAsia="Times New Roman" w:cstheme="minorHAnsi"/>
-          <w:color w:val="000000"/>
-          <w:highlight w:val="yellow"/>
-          <w:lang w:eastAsia="ca-ES"/>
-        </w:rPr>
-        <w:fldChar w:fldCharType="begin" w:fldLock="1"/>
-      </w:r>
-      <w:r>
-        <w:rPr>
-          <w:rFonts w:eastAsia="Times New Roman" w:cstheme="minorHAnsi"/>
-          <w:color w:val="000000"/>
-          <w:highlight w:val="yellow"/>
-          <w:lang w:eastAsia="ca-ES"/>
-        </w:rPr>
-        <w:instrText>ADDIN CSL_CITATION {"citationItems":[{"id":"ITEM-1","itemData":{"DOI":"10.18637/jss.v025.i01","author":[{"dropping-particle":"","family":"Le","given":"Sebastien","non-dropping-particle":"","parse-names":false,"suffix":""},{"dropping-particle":"","family":"Josse","given":"Julie","non-dropping-particle":"","parse-names":false,"suffix":""},{"dropping-particle":"","family":"Husson","given":"Francois","non-dropping-particle":"","parse-names":false,"suffix":""}],"container-title":"Journal of Statistical Software","id":"ITEM-1","issue":"1","issued":{"date-parts":[["2008"]]},"page":"1-18","title":"FactoMineR: A Package for Multivariate Analysis","type":"article-journal","volume":"25"},"uris":["http://www.mendeley.com/documents/?uuid=8e3d532c-b5ac-414b-9a49-b31aebfe11f0"]}],"mendeley":{"formattedCitation":"(Le, Josse and Husson, 2008)","plainTextFormattedCitation":"(Le, Josse and Husson, 2008)","previouslyFormattedCitation":"(Le, Josse and Husson, 2008)"},"properties":{"noteIndex":0},"schema":"https://github.com/citation-style-language/schema/raw/master/csl-citation.json"}</w:instrText>
-      </w:r>
-      <w:r>
-        <w:rPr>
-          <w:rFonts w:eastAsia="Times New Roman" w:cstheme="minorHAnsi"/>
-          <w:color w:val="000000"/>
-          <w:highlight w:val="yellow"/>
-          <w:lang w:eastAsia="ca-ES"/>
-        </w:rPr>
-        <w:fldChar w:fldCharType="separate"/>
-      </w:r>
-      <w:r>
-        <w:rPr>
-          <w:rFonts w:eastAsia="Times New Roman" w:cstheme="minorHAnsi"/>
-          <w:noProof/>
-          <w:color w:val="000000"/>
-          <w:highlight w:val="yellow"/>
-          <w:lang w:eastAsia="ca-ES"/>
-        </w:rPr>
-        <w:t>(Le, Josse and Husson, 2008)</w:t>
-      </w:r>
-      <w:r>
-        <w:rPr>
-          <w:rFonts w:eastAsia="Times New Roman" w:cstheme="minorHAnsi"/>
-          <w:color w:val="000000"/>
-          <w:highlight w:val="yellow"/>
-          <w:lang w:eastAsia="ca-ES"/>
-        </w:rPr>
-        <w:fldChar w:fldCharType="end"/>
-      </w:r>
-      <w:r>
-        <w:rPr>
-          <w:rFonts w:eastAsia="Times New Roman" w:cstheme="minorHAnsi"/>
-          <w:color w:val="000000"/>
-          <w:highlight w:val="yellow"/>
-          <w:lang w:eastAsia="ca-ES"/>
-        </w:rPr>
-        <w:t xml:space="preserve">. To select non redundant traits, we first did a correlation analysis with corrplot </w:t>
-      </w:r>
-      <w:r>
-        <w:rPr>
-          <w:rFonts w:eastAsia="Times New Roman" w:cstheme="minorHAnsi"/>
-          <w:color w:val="000000"/>
-          <w:highlight w:val="yellow"/>
-          <w:lang w:eastAsia="ca-ES"/>
-        </w:rPr>
-        <w:fldChar w:fldCharType="begin" w:fldLock="1"/>
-      </w:r>
-      <w:r>
-        <w:rPr>
-          <w:rFonts w:eastAsia="Times New Roman" w:cstheme="minorHAnsi"/>
-          <w:color w:val="000000"/>
-          <w:highlight w:val="yellow"/>
-          <w:lang w:eastAsia="ca-ES"/>
-        </w:rPr>
-        <w:instrText>ADDIN CSL_CITATION {"citationItems":[{"id":"ITEM-1","itemData":{"author":[{"dropping-particle":"","family":"Wei","given":"Taiyun","non-dropping-particle":"","parse-names":false,"suffix":""},{"dropping-particle":"","family":"Simko","given":"Viliam","non-dropping-particle":"","parse-names":false,"suffix":""}],"id":"ITEM-1","issued":{"date-parts":[["2021"]]},"number":"Version 0.92","title":"R package 'corrplot': Visualization of a Correlation Matrix","type":"article"},"uris":["http://www.mendeley.com/documents/?uuid=8acdcdfd-498d-4c09-b45c-e1f06b8189f7"]}],"mendeley":{"formattedCitation":"(Wei and Simko, 2021)","plainTextFormattedCitation":"(Wei and Simko, 2021)","previouslyFormattedCitation":"(Wei and Simko, 2021)"},"properties":{"noteIndex":0},"schema":"https://github.com/citation-style-language/schema/raw/master/csl-citation.json"}</w:instrText>
-      </w:r>
-      <w:r>
-        <w:rPr>
-          <w:rFonts w:eastAsia="Times New Roman" w:cstheme="minorHAnsi"/>
-          <w:color w:val="000000"/>
-          <w:highlight w:val="yellow"/>
-          <w:lang w:eastAsia="ca-ES"/>
-        </w:rPr>
-        <w:fldChar w:fldCharType="separate"/>
-      </w:r>
-      <w:r>
-        <w:rPr>
-          <w:rFonts w:eastAsia="Times New Roman" w:cstheme="minorHAnsi"/>
-          <w:noProof/>
-          <w:color w:val="000000"/>
-          <w:highlight w:val="yellow"/>
-          <w:lang w:eastAsia="ca-ES"/>
-        </w:rPr>
-        <w:t>(Wei and Simko, 2021)</w:t>
-      </w:r>
-      <w:r>
-        <w:rPr>
-          <w:rFonts w:eastAsia="Times New Roman" w:cstheme="minorHAnsi"/>
-          <w:color w:val="000000"/>
-          <w:highlight w:val="yellow"/>
-          <w:lang w:eastAsia="ca-ES"/>
-        </w:rPr>
-        <w:fldChar w:fldCharType="end"/>
-      </w:r>
-      <w:r>
-        <w:rPr>
-          <w:rFonts w:eastAsia="Times New Roman" w:cstheme="minorHAnsi"/>
-          <w:color w:val="000000"/>
-          <w:highlight w:val="yellow"/>
-          <w:lang w:eastAsia="ca-ES"/>
-        </w:rPr>
-        <w:t xml:space="preserve"> of all seven traits (supporting information Fig. S3), considering the high correlation between t50 and autumn germination (- 0.94) we decided to keep the later.</w:t>
-      </w:r>
+        <w:rPr>
+          <w:rFonts w:eastAsia="Times New Roman" w:cstheme="minorHAnsi"/>
+          <w:color w:val="000000"/>
+          <w:lang w:eastAsia="ca-ES"/>
+        </w:rPr>
+      </w:pPr>
     </w:p>
     <w:p>
       <w:pPr>
+        <w:pStyle w:val="Ttulo2"/>
+      </w:pPr>
+      <w:r>
+        <w:lastRenderedPageBreak/>
+        <w:t>3.</w:t>
+      </w:r>
+      <w:r>
+        <w:t xml:space="preserve"> Preliminary results</w:t>
+      </w:r>
+    </w:p>
+    <w:p/>
+    <w:p/>
+    <w:p>
+      <w:pPr>
         <w:spacing w:line="360" w:lineRule="auto"/>
         <w:rPr>
           <w:color w:val="FF0000"/>
@@ -4799,8 +6416,21 @@
       <w:pPr>
         <w:spacing w:line="360" w:lineRule="auto"/>
       </w:pPr>
-      <w:r>
-        <w:t>iButtons recording period from different years! However we are not comparing it, only using it to calculate species realized niche (optimal adult conditions)</w:t>
+      <w:proofErr w:type="spellStart"/>
+      <w:r>
+        <w:t>iButtons</w:t>
+      </w:r>
+      <w:proofErr w:type="spellEnd"/>
+      <w:r>
+        <w:t xml:space="preserve"> recording period from different years! </w:t>
+      </w:r>
+      <w:proofErr w:type="gramStart"/>
+      <w:r>
+        <w:t>However</w:t>
+      </w:r>
+      <w:proofErr w:type="gramEnd"/>
+      <w:r>
+        <w:t xml:space="preserve"> we are not comparing it, only using it to calculate species realized niche (optimal adult conditions)</w:t>
       </w:r>
     </w:p>
     <w:p>
@@ -4812,7 +6442,7 @@
       </w:r>
     </w:p>
     <w:sectPr>
-      <w:footerReference w:type="default" r:id="rId11"/>
+      <w:footerReference w:type="default" r:id="rId16"/>
       <w:pgSz w:w="11906" w:h="16838"/>
       <w:pgMar w:top="1417" w:right="1701" w:bottom="1417" w:left="1701" w:header="708" w:footer="708" w:gutter="0"/>
       <w:lnNumType w:countBy="1" w:restart="continuous"/>
@@ -4825,7 +6455,7 @@
 
 <file path=word/comments.xml><?xml version="1.0" encoding="utf-8"?>
 <w:comments xmlns:wpc="http://schemas.microsoft.com/office/word/2010/wordprocessingCanvas" xmlns:cx="http://schemas.microsoft.com/office/drawing/2014/chartex" xmlns:cx1="http://schemas.microsoft.com/office/drawing/2015/9/8/chartex" xmlns:cx2="http://schemas.microsoft.com/office/drawing/2015/10/21/chartex" xmlns:cx3="http://schemas.microsoft.com/office/drawing/2016/5/9/chartex" xmlns:cx4="http://schemas.microsoft.com/office/drawing/2016/5/10/chartex" xmlns:cx5="http://schemas.microsoft.com/office/drawing/2016/5/11/chartex" xmlns:cx6="http://schemas.microsoft.com/office/drawing/2016/5/12/chartex" xmlns:cx7="http://schemas.microsoft.com/office/drawing/2016/5/13/chartex" xmlns:cx8="http://schemas.microsoft.com/office/drawing/2016/5/14/chartex" xmlns:mc="http://schemas.openxmlformats.org/markup-compatibility/2006" xmlns:aink="http://schemas.microsoft.com/office/drawing/2016/ink" xmlns:am3d="http://schemas.microsoft.com/office/drawing/2017/model3d" xmlns:o="urn:schemas-microsoft-com:office:office" xmlns:oel="http://schemas.microsoft.com/office/2019/extlst" xmlns:r="http://schemas.openxmlformats.org/officeDocument/2006/relationships" xmlns:m="http://schemas.openxmlformats.org/officeDocument/2006/math" xmlns:v="urn:schemas-microsoft-com:vml" xmlns:wp14="http://schemas.microsoft.com/office/word/2010/wordprocessingDrawing" xmlns:wp="http://schemas.openxmlformats.org/drawingml/2006/wordprocessingDrawing" xmlns:w10="urn:schemas-microsoft-com:office:word" xmlns:w="http://schemas.openxmlformats.org/wordprocessingml/2006/main" xmlns:w14="http://schemas.microsoft.com/office/word/2010/wordml" xmlns:w15="http://schemas.microsoft.com/office/word/2012/wordml" xmlns:w16cex="http://schemas.microsoft.com/office/word/2018/wordml/cex" xmlns:w16cid="http://schemas.microsoft.com/office/word/2016/wordml/cid" xmlns:w16="http://schemas.microsoft.com/office/word/2018/wordml" xmlns:w16sdtdh="http://schemas.microsoft.com/office/word/2020/wordml/sdtdatahash" xmlns:w16se="http://schemas.microsoft.com/office/word/2015/wordml/symex" xmlns:wpg="http://schemas.microsoft.com/office/word/2010/wordprocessingGroup" xmlns:wpi="http://schemas.microsoft.com/office/word/2010/wordprocessingInk" xmlns:wne="http://schemas.microsoft.com/office/word/2006/wordml" xmlns:wps="http://schemas.microsoft.com/office/word/2010/wordprocessingShape" mc:Ignorable="w14 w15 w16se w16cid w16 w16cex w16sdtdh wp14">
-  <w:comment w:id="0" w:author="CLARA ESPINOSA DEL ALBA" w:date="2024-01-30T08:39:00Z" w:initials="CE">
+  <w:comment w:id="0" w:author="CLARA ESPINOSA DEL ALBA" w:date="2024-04-15T09:37:00Z" w:initials="CE">
     <w:p>
       <w:pPr>
         <w:pStyle w:val="Textocomentario"/>
@@ -4837,11 +6467,11 @@
         <w:annotationRef/>
       </w:r>
       <w:r>
-        <w:t>Rewrite all paragraph from Move-along paper</w:t>
+        <w:t>From SEEDALP proposal!</w:t>
       </w:r>
     </w:p>
   </w:comment>
-  <w:comment w:id="1" w:author="CLARA ESPINOSA DEL ALBA" w:date="2024-01-30T09:34:00Z" w:initials="CE">
+  <w:comment w:id="1" w:author="CLARA ESPINOSA DEL ALBA" w:date="2024-04-15T09:51:00Z" w:initials="CE">
     <w:p>
       <w:pPr>
         <w:pStyle w:val="Textocomentario"/>
@@ -4853,11 +6483,43 @@
         <w:annotationRef/>
       </w:r>
       <w:r>
-        <w:t>From JVA 2024 Picos paper</w:t>
+        <w:t>From seedalp proposal obj 3</w:t>
       </w:r>
     </w:p>
   </w:comment>
-  <w:comment w:id="2" w:author="CLARA ESPINOSA DEL ALBA" w:date="2024-01-30T15:27:00Z" w:initials="CE">
+  <w:comment w:id="2" w:author="CLARA ESPINOSA DEL ALBA" w:date="2024-01-30T08:39:00Z" w:initials="CE">
+    <w:p>
+      <w:pPr>
+        <w:pStyle w:val="Textocomentario"/>
+      </w:pPr>
+      <w:r>
+        <w:rPr>
+          <w:rStyle w:val="Refdecomentario"/>
+        </w:rPr>
+        <w:annotationRef/>
+      </w:r>
+      <w:r>
+        <w:t>Rewrite all paragraph from Move-along paper</w:t>
+      </w:r>
+    </w:p>
+  </w:comment>
+  <w:comment w:id="3" w:author="CLARA ESPINOSA DEL ALBA" w:date="2024-01-30T09:34:00Z" w:initials="CE">
+    <w:p>
+      <w:pPr>
+        <w:pStyle w:val="Textocomentario"/>
+      </w:pPr>
+      <w:r>
+        <w:rPr>
+          <w:rStyle w:val="Refdecomentario"/>
+        </w:rPr>
+        <w:annotationRef/>
+      </w:r>
+      <w:r>
+        <w:t>From JVA 2024 Picos paper</w:t>
+      </w:r>
+    </w:p>
+  </w:comment>
+  <w:comment w:id="4" w:author="CLARA ESPINOSA DEL ALBA" w:date="2024-01-30T15:27:00Z" w:initials="CE">
     <w:p>
       <w:pPr>
         <w:pStyle w:val="Textocomentario"/>
@@ -4878,6 +6540,8 @@
 
 <file path=word/commentsExtended.xml><?xml version="1.0" encoding="utf-8"?>
 <w15:commentsEx xmlns:wpc="http://schemas.microsoft.com/office/word/2010/wordprocessingCanvas" xmlns:cx="http://schemas.microsoft.com/office/drawing/2014/chartex" xmlns:cx1="http://schemas.microsoft.com/office/drawing/2015/9/8/chartex" xmlns:cx2="http://schemas.microsoft.com/office/drawing/2015/10/21/chartex" xmlns:cx3="http://schemas.microsoft.com/office/drawing/2016/5/9/chartex" xmlns:cx4="http://schemas.microsoft.com/office/drawing/2016/5/10/chartex" xmlns:cx5="http://schemas.microsoft.com/office/drawing/2016/5/11/chartex" xmlns:cx6="http://schemas.microsoft.com/office/drawing/2016/5/12/chartex" xmlns:cx7="http://schemas.microsoft.com/office/drawing/2016/5/13/chartex" xmlns:cx8="http://schemas.microsoft.com/office/drawing/2016/5/14/chartex" xmlns:mc="http://schemas.openxmlformats.org/markup-compatibility/2006" xmlns:aink="http://schemas.microsoft.com/office/drawing/2016/ink" xmlns:am3d="http://schemas.microsoft.com/office/drawing/2017/model3d" xmlns:o="urn:schemas-microsoft-com:office:office" xmlns:oel="http://schemas.microsoft.com/office/2019/extlst" xmlns:r="http://schemas.openxmlformats.org/officeDocument/2006/relationships" xmlns:m="http://schemas.openxmlformats.org/officeDocument/2006/math" xmlns:v="urn:schemas-microsoft-com:vml" xmlns:wp14="http://schemas.microsoft.com/office/word/2010/wordprocessingDrawing" xmlns:wp="http://schemas.openxmlformats.org/drawingml/2006/wordprocessingDrawing" xmlns:w10="urn:schemas-microsoft-com:office:word" xmlns:w="http://schemas.openxmlformats.org/wordprocessingml/2006/main" xmlns:w14="http://schemas.microsoft.com/office/word/2010/wordml" xmlns:w15="http://schemas.microsoft.com/office/word/2012/wordml" xmlns:w16cex="http://schemas.microsoft.com/office/word/2018/wordml/cex" xmlns:w16cid="http://schemas.microsoft.com/office/word/2016/wordml/cid" xmlns:w16="http://schemas.microsoft.com/office/word/2018/wordml" xmlns:w16sdtdh="http://schemas.microsoft.com/office/word/2020/wordml/sdtdatahash" xmlns:w16se="http://schemas.microsoft.com/office/word/2015/wordml/symex" xmlns:wpg="http://schemas.microsoft.com/office/word/2010/wordprocessingGroup" xmlns:wpi="http://schemas.microsoft.com/office/word/2010/wordprocessingInk" xmlns:wne="http://schemas.microsoft.com/office/word/2006/wordml" xmlns:wps="http://schemas.microsoft.com/office/word/2010/wordprocessingShape" mc:Ignorable="w14 w15 w16se w16cid w16 w16cex w16sdtdh wp14">
+  <w15:commentEx w15:paraId="7129F811" w15:done="0"/>
+  <w15:commentEx w15:paraId="18501729" w15:done="0"/>
   <w15:commentEx w15:paraId="45405D54" w15:done="0"/>
   <w15:commentEx w15:paraId="062E70A4" w15:done="0"/>
   <w15:commentEx w15:paraId="15B37E00" w15:done="0"/>
@@ -4886,6 +6550,8 @@
 
 <file path=word/commentsExtensible.xml><?xml version="1.0" encoding="utf-8"?>
 <w16cex:commentsExtensible xmlns:wpc="http://schemas.microsoft.com/office/word/2010/wordprocessingCanvas" xmlns:cx="http://schemas.microsoft.com/office/drawing/2014/chartex" xmlns:cx1="http://schemas.microsoft.com/office/drawing/2015/9/8/chartex" xmlns:cx2="http://schemas.microsoft.com/office/drawing/2015/10/21/chartex" xmlns:cx3="http://schemas.microsoft.com/office/drawing/2016/5/9/chartex" xmlns:cx4="http://schemas.microsoft.com/office/drawing/2016/5/10/chartex" xmlns:cx5="http://schemas.microsoft.com/office/drawing/2016/5/11/chartex" xmlns:cx6="http://schemas.microsoft.com/office/drawing/2016/5/12/chartex" xmlns:cx7="http://schemas.microsoft.com/office/drawing/2016/5/13/chartex" xmlns:cx8="http://schemas.microsoft.com/office/drawing/2016/5/14/chartex" xmlns:cr="http://schemas.microsoft.com/office/comments/2020/reactions" xmlns:mc="http://schemas.openxmlformats.org/markup-compatibility/2006" xmlns:aink="http://schemas.microsoft.com/office/drawing/2016/ink" xmlns:am3d="http://schemas.microsoft.com/office/drawing/2017/model3d" xmlns:o="urn:schemas-microsoft-com:office:office" xmlns:oel="http://schemas.microsoft.com/office/2019/extlst" xmlns:r="http://schemas.openxmlformats.org/officeDocument/2006/relationships" xmlns:m="http://schemas.openxmlformats.org/officeDocument/2006/math" xmlns:v="urn:schemas-microsoft-com:vml" xmlns:wp14="http://schemas.microsoft.com/office/word/2010/wordprocessingDrawing" xmlns:wp="http://schemas.openxmlformats.org/drawingml/2006/wordprocessingDrawing" xmlns:w10="urn:schemas-microsoft-com:office:word" xmlns:w="http://schemas.openxmlformats.org/wordprocessingml/2006/main" xmlns:w14="http://schemas.microsoft.com/office/word/2010/wordml" xmlns:w15="http://schemas.microsoft.com/office/word/2012/wordml" xmlns:w16cex="http://schemas.microsoft.com/office/word/2018/wordml/cex" xmlns:w16cid="http://schemas.microsoft.com/office/word/2016/wordml/cid" xmlns:w16="http://schemas.microsoft.com/office/word/2018/wordml" xmlns:w16sdtdh="http://schemas.microsoft.com/office/word/2020/wordml/sdtdatahash" xmlns:w16se="http://schemas.microsoft.com/office/word/2015/wordml/symex" xmlns:wpg="http://schemas.microsoft.com/office/word/2010/wordprocessingGroup" xmlns:wpi="http://schemas.microsoft.com/office/word/2010/wordprocessingInk" xmlns:wne="http://schemas.microsoft.com/office/word/2006/wordml" xmlns:wps="http://schemas.microsoft.com/office/word/2010/wordprocessingShape" mc:Ignorable="w14 w15 w16se w16cid w16 w16cex w16sdtdh cr wp14">
+  <w16cex:commentExtensible w16cex:durableId="32EE9A59" w16cex:dateUtc="2024-04-15T07:37:00Z"/>
+  <w16cex:commentExtensible w16cex:durableId="7DFA6FCE" w16cex:dateUtc="2024-04-15T07:51:00Z"/>
   <w16cex:commentExtensible w16cex:durableId="01FAA402" w16cex:dateUtc="2024-01-30T07:39:00Z"/>
   <w16cex:commentExtensible w16cex:durableId="592F899A" w16cex:dateUtc="2024-01-30T08:34:00Z"/>
   <w16cex:commentExtensible w16cex:durableId="16DC57B9" w16cex:dateUtc="2024-01-30T14:27:00Z"/>
@@ -4894,6 +6560,8 @@
 
 <file path=word/commentsIds.xml><?xml version="1.0" encoding="utf-8"?>
 <w16cid:commentsIds xmlns:wpc="http://schemas.microsoft.com/office/word/2010/wordprocessingCanvas" xmlns:cx="http://schemas.microsoft.com/office/drawing/2014/chartex" xmlns:cx1="http://schemas.microsoft.com/office/drawing/2015/9/8/chartex" xmlns:cx2="http://schemas.microsoft.com/office/drawing/2015/10/21/chartex" xmlns:cx3="http://schemas.microsoft.com/office/drawing/2016/5/9/chartex" xmlns:cx4="http://schemas.microsoft.com/office/drawing/2016/5/10/chartex" xmlns:cx5="http://schemas.microsoft.com/office/drawing/2016/5/11/chartex" xmlns:cx6="http://schemas.microsoft.com/office/drawing/2016/5/12/chartex" xmlns:cx7="http://schemas.microsoft.com/office/drawing/2016/5/13/chartex" xmlns:cx8="http://schemas.microsoft.com/office/drawing/2016/5/14/chartex" xmlns:mc="http://schemas.openxmlformats.org/markup-compatibility/2006" xmlns:aink="http://schemas.microsoft.com/office/drawing/2016/ink" xmlns:am3d="http://schemas.microsoft.com/office/drawing/2017/model3d" xmlns:o="urn:schemas-microsoft-com:office:office" xmlns:oel="http://schemas.microsoft.com/office/2019/extlst" xmlns:r="http://schemas.openxmlformats.org/officeDocument/2006/relationships" xmlns:m="http://schemas.openxmlformats.org/officeDocument/2006/math" xmlns:v="urn:schemas-microsoft-com:vml" xmlns:wp14="http://schemas.microsoft.com/office/word/2010/wordprocessingDrawing" xmlns:wp="http://schemas.openxmlformats.org/drawingml/2006/wordprocessingDrawing" xmlns:w10="urn:schemas-microsoft-com:office:word" xmlns:w="http://schemas.openxmlformats.org/wordprocessingml/2006/main" xmlns:w14="http://schemas.microsoft.com/office/word/2010/wordml" xmlns:w15="http://schemas.microsoft.com/office/word/2012/wordml" xmlns:w16cex="http://schemas.microsoft.com/office/word/2018/wordml/cex" xmlns:w16cid="http://schemas.microsoft.com/office/word/2016/wordml/cid" xmlns:w16="http://schemas.microsoft.com/office/word/2018/wordml" xmlns:w16sdtdh="http://schemas.microsoft.com/office/word/2020/wordml/sdtdatahash" xmlns:w16se="http://schemas.microsoft.com/office/word/2015/wordml/symex" xmlns:wpg="http://schemas.microsoft.com/office/word/2010/wordprocessingGroup" xmlns:wpi="http://schemas.microsoft.com/office/word/2010/wordprocessingInk" xmlns:wne="http://schemas.microsoft.com/office/word/2006/wordml" xmlns:wps="http://schemas.microsoft.com/office/word/2010/wordprocessingShape" mc:Ignorable="w14 w15 w16se w16cid w16 w16cex w16sdtdh wp14">
+  <w16cid:commentId w16cid:paraId="7129F811" w16cid:durableId="32EE9A59"/>
+  <w16cid:commentId w16cid:paraId="18501729" w16cid:durableId="7DFA6FCE"/>
   <w16cid:commentId w16cid:paraId="45405D54" w16cid:durableId="01FAA402"/>
   <w16cid:commentId w16cid:paraId="062E70A4" w16cid:durableId="592F899A"/>
   <w16cid:commentId w16cid:paraId="15B37E00" w16cid:durableId="16DC57B9"/>
@@ -7433,6 +9101,95 @@
     </w:lvl>
   </w:abstractNum>
   <w:abstractNum w:abstractNumId="19" w15:restartNumberingAfterBreak="0">
+    <w:nsid w:val="4BE973C1"/>
+    <w:multiLevelType w:val="hybridMultilevel"/>
+    <w:tmpl w:val="779C246A"/>
+    <w:lvl w:ilvl="0" w:tplc="0C0A000F">
+      <w:start w:val="1"/>
+      <w:numFmt w:val="decimal"/>
+      <w:lvlText w:val="%1."/>
+      <w:lvlJc w:val="left"/>
+      <w:pPr>
+        <w:ind w:left="720" w:hanging="360"/>
+      </w:pPr>
+      <w:rPr>
+        <w:rFonts w:hint="default"/>
+      </w:rPr>
+    </w:lvl>
+    <w:lvl w:ilvl="1" w:tplc="0C0A0019" w:tentative="1">
+      <w:start w:val="1"/>
+      <w:numFmt w:val="lowerLetter"/>
+      <w:lvlText w:val="%2."/>
+      <w:lvlJc w:val="left"/>
+      <w:pPr>
+        <w:ind w:left="1440" w:hanging="360"/>
+      </w:pPr>
+    </w:lvl>
+    <w:lvl w:ilvl="2" w:tplc="0C0A001B" w:tentative="1">
+      <w:start w:val="1"/>
+      <w:numFmt w:val="lowerRoman"/>
+      <w:lvlText w:val="%3."/>
+      <w:lvlJc w:val="right"/>
+      <w:pPr>
+        <w:ind w:left="2160" w:hanging="180"/>
+      </w:pPr>
+    </w:lvl>
+    <w:lvl w:ilvl="3" w:tplc="0C0A000F" w:tentative="1">
+      <w:start w:val="1"/>
+      <w:numFmt w:val="decimal"/>
+      <w:lvlText w:val="%4."/>
+      <w:lvlJc w:val="left"/>
+      <w:pPr>
+        <w:ind w:left="2880" w:hanging="360"/>
+      </w:pPr>
+    </w:lvl>
+    <w:lvl w:ilvl="4" w:tplc="0C0A0019" w:tentative="1">
+      <w:start w:val="1"/>
+      <w:numFmt w:val="lowerLetter"/>
+      <w:lvlText w:val="%5."/>
+      <w:lvlJc w:val="left"/>
+      <w:pPr>
+        <w:ind w:left="3600" w:hanging="360"/>
+      </w:pPr>
+    </w:lvl>
+    <w:lvl w:ilvl="5" w:tplc="0C0A001B" w:tentative="1">
+      <w:start w:val="1"/>
+      <w:numFmt w:val="lowerRoman"/>
+      <w:lvlText w:val="%6."/>
+      <w:lvlJc w:val="right"/>
+      <w:pPr>
+        <w:ind w:left="4320" w:hanging="180"/>
+      </w:pPr>
+    </w:lvl>
+    <w:lvl w:ilvl="6" w:tplc="0C0A000F" w:tentative="1">
+      <w:start w:val="1"/>
+      <w:numFmt w:val="decimal"/>
+      <w:lvlText w:val="%7."/>
+      <w:lvlJc w:val="left"/>
+      <w:pPr>
+        <w:ind w:left="5040" w:hanging="360"/>
+      </w:pPr>
+    </w:lvl>
+    <w:lvl w:ilvl="7" w:tplc="0C0A0019" w:tentative="1">
+      <w:start w:val="1"/>
+      <w:numFmt w:val="lowerLetter"/>
+      <w:lvlText w:val="%8."/>
+      <w:lvlJc w:val="left"/>
+      <w:pPr>
+        <w:ind w:left="5760" w:hanging="360"/>
+      </w:pPr>
+    </w:lvl>
+    <w:lvl w:ilvl="8" w:tplc="0C0A001B" w:tentative="1">
+      <w:start w:val="1"/>
+      <w:numFmt w:val="lowerRoman"/>
+      <w:lvlText w:val="%9."/>
+      <w:lvlJc w:val="right"/>
+      <w:pPr>
+        <w:ind w:left="6480" w:hanging="180"/>
+      </w:pPr>
+    </w:lvl>
+  </w:abstractNum>
+  <w:abstractNum w:abstractNumId="20" w15:restartNumberingAfterBreak="0">
     <w:nsid w:val="4DD35EC8"/>
     <w:multiLevelType w:val="hybridMultilevel"/>
     <w:tmpl w:val="4F0ABA3C"/>
@@ -7521,7 +9278,7 @@
       </w:pPr>
     </w:lvl>
   </w:abstractNum>
-  <w:abstractNum w:abstractNumId="20" w15:restartNumberingAfterBreak="0">
+  <w:abstractNum w:abstractNumId="21" w15:restartNumberingAfterBreak="0">
     <w:nsid w:val="4FE9544E"/>
     <w:multiLevelType w:val="multilevel"/>
     <w:tmpl w:val="E522C7F4"/>
@@ -7670,7 +9427,7 @@
       </w:rPr>
     </w:lvl>
   </w:abstractNum>
-  <w:abstractNum w:abstractNumId="21" w15:restartNumberingAfterBreak="0">
+  <w:abstractNum w:abstractNumId="22" w15:restartNumberingAfterBreak="0">
     <w:nsid w:val="535B100D"/>
     <w:multiLevelType w:val="hybridMultilevel"/>
     <w:tmpl w:val="0D666A68"/>
@@ -7810,7 +9567,7 @@
       </w:rPr>
     </w:lvl>
   </w:abstractNum>
-  <w:abstractNum w:abstractNumId="22" w15:restartNumberingAfterBreak="0">
+  <w:abstractNum w:abstractNumId="23" w15:restartNumberingAfterBreak="0">
     <w:nsid w:val="6B80667F"/>
     <w:multiLevelType w:val="hybridMultilevel"/>
     <w:tmpl w:val="8D1871F6"/>
@@ -7899,7 +9656,7 @@
       </w:pPr>
     </w:lvl>
   </w:abstractNum>
-  <w:abstractNum w:abstractNumId="23" w15:restartNumberingAfterBreak="0">
+  <w:abstractNum w:abstractNumId="24" w15:restartNumberingAfterBreak="0">
     <w:nsid w:val="6C2D5A6F"/>
     <w:multiLevelType w:val="multilevel"/>
     <w:tmpl w:val="53C8A96A"/>
@@ -8048,7 +9805,7 @@
       </w:rPr>
     </w:lvl>
   </w:abstractNum>
-  <w:abstractNum w:abstractNumId="24" w15:restartNumberingAfterBreak="0">
+  <w:abstractNum w:abstractNumId="25" w15:restartNumberingAfterBreak="0">
     <w:nsid w:val="724F1BA5"/>
     <w:multiLevelType w:val="hybridMultilevel"/>
     <w:tmpl w:val="4990AD40"/>
@@ -8137,7 +9894,7 @@
       </w:pPr>
     </w:lvl>
   </w:abstractNum>
-  <w:abstractNum w:abstractNumId="25" w15:restartNumberingAfterBreak="0">
+  <w:abstractNum w:abstractNumId="26" w15:restartNumberingAfterBreak="0">
     <w:nsid w:val="7AE04102"/>
     <w:multiLevelType w:val="hybridMultilevel"/>
     <w:tmpl w:val="C55E398E"/>
@@ -8226,7 +9983,7 @@
       </w:pPr>
     </w:lvl>
   </w:abstractNum>
-  <w:abstractNum w:abstractNumId="26" w15:restartNumberingAfterBreak="0">
+  <w:abstractNum w:abstractNumId="27" w15:restartNumberingAfterBreak="0">
     <w:nsid w:val="7AEA239B"/>
     <w:multiLevelType w:val="multilevel"/>
     <w:tmpl w:val="510A4F2A"/>
@@ -8382,13 +10139,13 @@
     <w:abstractNumId w:val="8"/>
   </w:num>
   <w:num w:numId="3" w16cid:durableId="975256845">
-    <w:abstractNumId w:val="20"/>
+    <w:abstractNumId w:val="21"/>
   </w:num>
   <w:num w:numId="4" w16cid:durableId="316767415">
     <w:abstractNumId w:val="17"/>
   </w:num>
   <w:num w:numId="5" w16cid:durableId="209222800">
-    <w:abstractNumId w:val="23"/>
+    <w:abstractNumId w:val="24"/>
   </w:num>
   <w:num w:numId="6" w16cid:durableId="794639397">
     <w:abstractNumId w:val="14"/>
@@ -8400,7 +10157,7 @@
     <w:abstractNumId w:val="6"/>
   </w:num>
   <w:num w:numId="9" w16cid:durableId="1367607331">
-    <w:abstractNumId w:val="21"/>
+    <w:abstractNumId w:val="22"/>
   </w:num>
   <w:num w:numId="10" w16cid:durableId="1828590164">
     <w:abstractNumId w:val="16"/>
@@ -8418,7 +10175,7 @@
     <w:abstractNumId w:val="4"/>
   </w:num>
   <w:num w:numId="15" w16cid:durableId="1520194440">
-    <w:abstractNumId w:val="26"/>
+    <w:abstractNumId w:val="27"/>
   </w:num>
   <w:num w:numId="16" w16cid:durableId="1301153941">
     <w:abstractNumId w:val="5"/>
@@ -8433,7 +10190,7 @@
     <w:abstractNumId w:val="12"/>
   </w:num>
   <w:num w:numId="20" w16cid:durableId="1402823819">
-    <w:abstractNumId w:val="24"/>
+    <w:abstractNumId w:val="25"/>
   </w:num>
   <w:num w:numId="21" w16cid:durableId="570504874">
     <w:abstractNumId w:val="10"/>
@@ -8445,16 +10202,19 @@
     <w:abstractNumId w:val="0"/>
   </w:num>
   <w:num w:numId="24" w16cid:durableId="1571115790">
-    <w:abstractNumId w:val="19"/>
+    <w:abstractNumId w:val="20"/>
   </w:num>
   <w:num w:numId="25" w16cid:durableId="249243640">
-    <w:abstractNumId w:val="25"/>
+    <w:abstractNumId w:val="26"/>
   </w:num>
   <w:num w:numId="26" w16cid:durableId="18750143">
-    <w:abstractNumId w:val="22"/>
+    <w:abstractNumId w:val="23"/>
   </w:num>
   <w:num w:numId="27" w16cid:durableId="1132478639">
     <w:abstractNumId w:val="9"/>
+  </w:num>
+  <w:num w:numId="28" w16cid:durableId="1630936430">
+    <w:abstractNumId w:val="19"/>
   </w:num>
 </w:numbering>
 </file>
@@ -8964,7 +10724,6 @@
   <w:style w:type="character" w:default="1" w:styleId="Fuentedeprrafopredeter">
     <w:name w:val="Default Paragraph Font"/>
     <w:uiPriority w:val="1"/>
-    <w:semiHidden/>
     <w:unhideWhenUsed/>
   </w:style>
   <w:style w:type="table" w:default="1" w:styleId="Tablanormal">

</xml_diff>